<commit_message>
Add testing site documentation and update Pflichtenheft files
</commit_message>
<xml_diff>
--- a/docs/Pflichtenheft/Splatgames.de Software - ParVer Pflichtenheft.docx
+++ b/docs/Pflichtenheft/Splatgames.de Software - ParVer Pflichtenheft.docx
@@ -587,6 +587,12 @@
     </w:p>
     <w:sdt>
       <w:sdtPr>
+        <w:rPr>
+          <w:rFonts w:asciiTheme="minorHAnsi" w:eastAsiaTheme="minorEastAsia" w:hAnsiTheme="minorHAnsi" w:cstheme="minorBidi"/>
+          <w:color w:val="auto"/>
+          <w:sz w:val="22"/>
+          <w:szCs w:val="22"/>
+        </w:rPr>
         <w:id w:val="-536745569"/>
         <w:docPartObj>
           <w:docPartGallery w:val="Table of Contents"/>
@@ -595,12 +601,8 @@
       </w:sdtPr>
       <w:sdtEndPr>
         <w:rPr>
-          <w:rFonts w:asciiTheme="minorHAnsi" w:eastAsiaTheme="minorEastAsia" w:hAnsiTheme="minorHAnsi" w:cstheme="minorBidi"/>
           <w:b/>
           <w:bCs/>
-          <w:color w:val="auto"/>
-          <w:sz w:val="22"/>
-          <w:szCs w:val="22"/>
         </w:rPr>
       </w:sdtEndPr>
       <w:sdtContent>
@@ -635,7 +637,7 @@
           <w:r>
             <w:fldChar w:fldCharType="separate"/>
           </w:r>
-          <w:hyperlink w:anchor="_Toc223087153" w:history="1">
+          <w:hyperlink w:anchor="_Toc223357008" w:history="1">
             <w:r>
               <w:rPr>
                 <w:rStyle w:val="Hyperlink"/>
@@ -665,7 +667,7 @@
                 <w:noProof/>
                 <w:webHidden/>
               </w:rPr>
-              <w:instrText xml:space="preserve"> PAGEREF _Toc223087153 \h </w:instrText>
+              <w:instrText xml:space="preserve"> PAGEREF _Toc223357008 \h </w:instrText>
             </w:r>
             <w:r>
               <w:rPr>
@@ -685,7 +687,7 @@
                 <w:noProof/>
                 <w:webHidden/>
               </w:rPr>
-              <w:t>3</w:t>
+              <w:t>4</w:t>
             </w:r>
             <w:r>
               <w:rPr>
@@ -710,7 +712,7 @@
               <w14:ligatures w14:val="standardContextual"/>
             </w:rPr>
           </w:pPr>
-          <w:hyperlink w:anchor="_Toc223087154" w:history="1">
+          <w:hyperlink w:anchor="_Toc223357009" w:history="1">
             <w:r>
               <w:rPr>
                 <w:rStyle w:val="Hyperlink"/>
@@ -739,7 +741,7 @@
                 <w:noProof/>
                 <w:webHidden/>
               </w:rPr>
-              <w:instrText xml:space="preserve"> PAGEREF _Toc223087154 \h </w:instrText>
+              <w:instrText xml:space="preserve"> PAGEREF _Toc223357009 \h </w:instrText>
             </w:r>
             <w:r>
               <w:rPr>
@@ -759,7 +761,7 @@
                 <w:noProof/>
                 <w:webHidden/>
               </w:rPr>
-              <w:t>3</w:t>
+              <w:t>4</w:t>
             </w:r>
             <w:r>
               <w:rPr>
@@ -784,7 +786,7 @@
               <w14:ligatures w14:val="standardContextual"/>
             </w:rPr>
           </w:pPr>
-          <w:hyperlink w:anchor="_Toc223087155" w:history="1">
+          <w:hyperlink w:anchor="_Toc223357010" w:history="1">
             <w:r>
               <w:rPr>
                 <w:rStyle w:val="Hyperlink"/>
@@ -814,7 +816,7 @@
                 <w:noProof/>
                 <w:webHidden/>
               </w:rPr>
-              <w:instrText xml:space="preserve"> PAGEREF _Toc223087155 \h </w:instrText>
+              <w:instrText xml:space="preserve"> PAGEREF _Toc223357010 \h </w:instrText>
             </w:r>
             <w:r>
               <w:rPr>
@@ -834,7 +836,7 @@
                 <w:noProof/>
                 <w:webHidden/>
               </w:rPr>
-              <w:t>3</w:t>
+              <w:t>4</w:t>
             </w:r>
             <w:r>
               <w:rPr>
@@ -859,7 +861,7 @@
               <w14:ligatures w14:val="standardContextual"/>
             </w:rPr>
           </w:pPr>
-          <w:hyperlink w:anchor="_Toc223087156" w:history="1">
+          <w:hyperlink w:anchor="_Toc223357011" w:history="1">
             <w:r>
               <w:rPr>
                 <w:rStyle w:val="Hyperlink"/>
@@ -889,7 +891,7 @@
                 <w:noProof/>
                 <w:webHidden/>
               </w:rPr>
-              <w:instrText xml:space="preserve"> PAGEREF _Toc223087156 \h </w:instrText>
+              <w:instrText xml:space="preserve"> PAGEREF _Toc223357011 \h </w:instrText>
             </w:r>
             <w:r>
               <w:rPr>
@@ -909,7 +911,7 @@
                 <w:noProof/>
                 <w:webHidden/>
               </w:rPr>
-              <w:t>4</w:t>
+              <w:t>5</w:t>
             </w:r>
             <w:r>
               <w:rPr>
@@ -934,7 +936,7 @@
               <w14:ligatures w14:val="standardContextual"/>
             </w:rPr>
           </w:pPr>
-          <w:hyperlink w:anchor="_Toc223087157" w:history="1">
+          <w:hyperlink w:anchor="_Toc223357012" w:history="1">
             <w:r>
               <w:rPr>
                 <w:rStyle w:val="Hyperlink"/>
@@ -964,7 +966,7 @@
                 <w:noProof/>
                 <w:webHidden/>
               </w:rPr>
-              <w:instrText xml:space="preserve"> PAGEREF _Toc223087157 \h </w:instrText>
+              <w:instrText xml:space="preserve"> PAGEREF _Toc223357012 \h </w:instrText>
             </w:r>
             <w:r>
               <w:rPr>
@@ -984,7 +986,7 @@
                 <w:noProof/>
                 <w:webHidden/>
               </w:rPr>
-              <w:t>4</w:t>
+              <w:t>5</w:t>
             </w:r>
             <w:r>
               <w:rPr>
@@ -1009,7 +1011,7 @@
               <w14:ligatures w14:val="standardContextual"/>
             </w:rPr>
           </w:pPr>
-          <w:hyperlink w:anchor="_Toc223087158" w:history="1">
+          <w:hyperlink w:anchor="_Toc223357013" w:history="1">
             <w:r>
               <w:rPr>
                 <w:rStyle w:val="Hyperlink"/>
@@ -1039,7 +1041,7 @@
                 <w:noProof/>
                 <w:webHidden/>
               </w:rPr>
-              <w:instrText xml:space="preserve"> PAGEREF _Toc223087158 \h </w:instrText>
+              <w:instrText xml:space="preserve"> PAGEREF _Toc223357013 \h </w:instrText>
             </w:r>
             <w:r>
               <w:rPr>
@@ -1059,7 +1061,7 @@
                 <w:noProof/>
                 <w:webHidden/>
               </w:rPr>
-              <w:t>4</w:t>
+              <w:t>5</w:t>
             </w:r>
             <w:r>
               <w:rPr>
@@ -1084,7 +1086,7 @@
               <w14:ligatures w14:val="standardContextual"/>
             </w:rPr>
           </w:pPr>
-          <w:hyperlink w:anchor="_Toc223087159" w:history="1">
+          <w:hyperlink w:anchor="_Toc223357014" w:history="1">
             <w:r>
               <w:rPr>
                 <w:rStyle w:val="Hyperlink"/>
@@ -1114,7 +1116,7 @@
                 <w:noProof/>
                 <w:webHidden/>
               </w:rPr>
-              <w:instrText xml:space="preserve"> PAGEREF _Toc223087159 \h </w:instrText>
+              <w:instrText xml:space="preserve"> PAGEREF _Toc223357014 \h </w:instrText>
             </w:r>
             <w:r>
               <w:rPr>
@@ -1134,7 +1136,7 @@
                 <w:noProof/>
                 <w:webHidden/>
               </w:rPr>
-              <w:t>5</w:t>
+              <w:t>6</w:t>
             </w:r>
             <w:r>
               <w:rPr>
@@ -1159,7 +1161,7 @@
               <w14:ligatures w14:val="standardContextual"/>
             </w:rPr>
           </w:pPr>
-          <w:hyperlink w:anchor="_Toc223087160" w:history="1">
+          <w:hyperlink w:anchor="_Toc223357015" w:history="1">
             <w:r>
               <w:rPr>
                 <w:rStyle w:val="Hyperlink"/>
@@ -1189,7 +1191,7 @@
                 <w:noProof/>
                 <w:webHidden/>
               </w:rPr>
-              <w:instrText xml:space="preserve"> PAGEREF _Toc223087160 \h </w:instrText>
+              <w:instrText xml:space="preserve"> PAGEREF _Toc223357015 \h </w:instrText>
             </w:r>
             <w:r>
               <w:rPr>
@@ -1209,7 +1211,7 @@
                 <w:noProof/>
                 <w:webHidden/>
               </w:rPr>
-              <w:t>5</w:t>
+              <w:t>6</w:t>
             </w:r>
             <w:r>
               <w:rPr>
@@ -1234,16 +1236,15 @@
               <w14:ligatures w14:val="standardContextual"/>
             </w:rPr>
           </w:pPr>
-          <w:hyperlink w:anchor="_Toc223087161" w:history="1">
+          <w:hyperlink w:anchor="_Toc223357016" w:history="1">
             <w:r>
               <w:rPr>
                 <w:rStyle w:val="Hyperlink"/>
                 <w:rFonts w:ascii="Arial" w:hAnsi="Arial" w:cs="Arial"/>
                 <w:b/>
-                <w:bCs/>
-                <w:noProof/>
-              </w:rPr>
-              <w:t>3.2 Parkplatzstatus und Freigabeprozess</w:t>
+                <w:noProof/>
+              </w:rPr>
+              <w:t>3.2 Parkplatzstatus und Belegungslogik</w:t>
             </w:r>
             <w:r>
               <w:rPr>
@@ -1264,7 +1265,7 @@
                 <w:noProof/>
                 <w:webHidden/>
               </w:rPr>
-              <w:instrText xml:space="preserve"> PAGEREF _Toc223087161 \h </w:instrText>
+              <w:instrText xml:space="preserve"> PAGEREF _Toc223357016 \h </w:instrText>
             </w:r>
             <w:r>
               <w:rPr>
@@ -1284,7 +1285,217 @@
                 <w:noProof/>
                 <w:webHidden/>
               </w:rPr>
-              <w:t>5</w:t>
+              <w:t>6</w:t>
+            </w:r>
+            <w:r>
+              <w:rPr>
+                <w:noProof/>
+                <w:webHidden/>
+              </w:rPr>
+              <w:fldChar w:fldCharType="end"/>
+            </w:r>
+          </w:hyperlink>
+        </w:p>
+        <w:p>
+          <w:pPr>
+            <w:pStyle w:val="Verzeichnis3"/>
+            <w:tabs>
+              <w:tab w:val="right" w:leader="dot" w:pos="9062"/>
+            </w:tabs>
+            <w:rPr>
+              <w:noProof/>
+            </w:rPr>
+          </w:pPr>
+          <w:hyperlink w:anchor="_Toc223357017" w:history="1">
+            <w:r>
+              <w:rPr>
+                <w:rStyle w:val="Hyperlink"/>
+                <w:rFonts w:ascii="Arial" w:hAnsi="Arial" w:cs="Arial"/>
+                <w:b/>
+                <w:noProof/>
+              </w:rPr>
+              <w:t>3.2.1 Differenzierung der Statuswerte</w:t>
+            </w:r>
+            <w:r>
+              <w:rPr>
+                <w:noProof/>
+                <w:webHidden/>
+              </w:rPr>
+              <w:tab/>
+            </w:r>
+            <w:r>
+              <w:rPr>
+                <w:noProof/>
+                <w:webHidden/>
+              </w:rPr>
+              <w:fldChar w:fldCharType="begin"/>
+            </w:r>
+            <w:r>
+              <w:rPr>
+                <w:noProof/>
+                <w:webHidden/>
+              </w:rPr>
+              <w:instrText xml:space="preserve"> PAGEREF _Toc223357017 \h </w:instrText>
+            </w:r>
+            <w:r>
+              <w:rPr>
+                <w:noProof/>
+                <w:webHidden/>
+              </w:rPr>
+            </w:r>
+            <w:r>
+              <w:rPr>
+                <w:noProof/>
+                <w:webHidden/>
+              </w:rPr>
+              <w:fldChar w:fldCharType="separate"/>
+            </w:r>
+            <w:r>
+              <w:rPr>
+                <w:noProof/>
+                <w:webHidden/>
+              </w:rPr>
+              <w:t>6</w:t>
+            </w:r>
+            <w:r>
+              <w:rPr>
+                <w:noProof/>
+                <w:webHidden/>
+              </w:rPr>
+              <w:fldChar w:fldCharType="end"/>
+            </w:r>
+          </w:hyperlink>
+        </w:p>
+        <w:p>
+          <w:pPr>
+            <w:pStyle w:val="Verzeichnis3"/>
+            <w:tabs>
+              <w:tab w:val="right" w:leader="dot" w:pos="9062"/>
+            </w:tabs>
+            <w:rPr>
+              <w:noProof/>
+            </w:rPr>
+          </w:pPr>
+          <w:hyperlink w:anchor="_Toc223357018" w:history="1">
+            <w:r>
+              <w:rPr>
+                <w:rStyle w:val="Hyperlink"/>
+                <w:rFonts w:ascii="Arial" w:hAnsi="Arial" w:cs="Arial"/>
+                <w:b/>
+                <w:noProof/>
+              </w:rPr>
+              <w:t>3.2.2 Freigabeprozess durch Parkplatzinhaber</w:t>
+            </w:r>
+            <w:r>
+              <w:rPr>
+                <w:noProof/>
+                <w:webHidden/>
+              </w:rPr>
+              <w:tab/>
+            </w:r>
+            <w:r>
+              <w:rPr>
+                <w:noProof/>
+                <w:webHidden/>
+              </w:rPr>
+              <w:fldChar w:fldCharType="begin"/>
+            </w:r>
+            <w:r>
+              <w:rPr>
+                <w:noProof/>
+                <w:webHidden/>
+              </w:rPr>
+              <w:instrText xml:space="preserve"> PAGEREF _Toc223357018 \h </w:instrText>
+            </w:r>
+            <w:r>
+              <w:rPr>
+                <w:noProof/>
+                <w:webHidden/>
+              </w:rPr>
+            </w:r>
+            <w:r>
+              <w:rPr>
+                <w:noProof/>
+                <w:webHidden/>
+              </w:rPr>
+              <w:fldChar w:fldCharType="separate"/>
+            </w:r>
+            <w:r>
+              <w:rPr>
+                <w:noProof/>
+                <w:webHidden/>
+              </w:rPr>
+              <w:t>6</w:t>
+            </w:r>
+            <w:r>
+              <w:rPr>
+                <w:noProof/>
+                <w:webHidden/>
+              </w:rPr>
+              <w:fldChar w:fldCharType="end"/>
+            </w:r>
+          </w:hyperlink>
+        </w:p>
+        <w:p>
+          <w:pPr>
+            <w:pStyle w:val="Verzeichnis3"/>
+            <w:tabs>
+              <w:tab w:val="right" w:leader="dot" w:pos="9062"/>
+            </w:tabs>
+            <w:rPr>
+              <w:noProof/>
+            </w:rPr>
+          </w:pPr>
+          <w:hyperlink w:anchor="_Toc223357019" w:history="1">
+            <w:r>
+              <w:rPr>
+                <w:rStyle w:val="Hyperlink"/>
+                <w:rFonts w:ascii="Arial" w:hAnsi="Arial" w:cs="Arial"/>
+                <w:b/>
+                <w:noProof/>
+              </w:rPr>
+              <w:t>3.2.3 Belegungsprozess durch Parkplatzsuchende</w:t>
+            </w:r>
+            <w:r>
+              <w:rPr>
+                <w:noProof/>
+                <w:webHidden/>
+              </w:rPr>
+              <w:tab/>
+            </w:r>
+            <w:r>
+              <w:rPr>
+                <w:noProof/>
+                <w:webHidden/>
+              </w:rPr>
+              <w:fldChar w:fldCharType="begin"/>
+            </w:r>
+            <w:r>
+              <w:rPr>
+                <w:noProof/>
+                <w:webHidden/>
+              </w:rPr>
+              <w:instrText xml:space="preserve"> PAGEREF _Toc223357019 \h </w:instrText>
+            </w:r>
+            <w:r>
+              <w:rPr>
+                <w:noProof/>
+                <w:webHidden/>
+              </w:rPr>
+            </w:r>
+            <w:r>
+              <w:rPr>
+                <w:noProof/>
+                <w:webHidden/>
+              </w:rPr>
+              <w:fldChar w:fldCharType="separate"/>
+            </w:r>
+            <w:r>
+              <w:rPr>
+                <w:noProof/>
+                <w:webHidden/>
+              </w:rPr>
+              <w:t>7</w:t>
             </w:r>
             <w:r>
               <w:rPr>
@@ -1309,7 +1520,7 @@
               <w14:ligatures w14:val="standardContextual"/>
             </w:rPr>
           </w:pPr>
-          <w:hyperlink w:anchor="_Toc223087162" w:history="1">
+          <w:hyperlink w:anchor="_Toc223357020" w:history="1">
             <w:r>
               <w:rPr>
                 <w:rStyle w:val="Hyperlink"/>
@@ -1339,7 +1550,7 @@
                 <w:noProof/>
                 <w:webHidden/>
               </w:rPr>
-              <w:instrText xml:space="preserve"> PAGEREF _Toc223087162 \h </w:instrText>
+              <w:instrText xml:space="preserve"> PAGEREF _Toc223357020 \h </w:instrText>
             </w:r>
             <w:r>
               <w:rPr>
@@ -1359,7 +1570,7 @@
                 <w:noProof/>
                 <w:webHidden/>
               </w:rPr>
-              <w:t>6</w:t>
+              <w:t>8</w:t>
             </w:r>
             <w:r>
               <w:rPr>
@@ -1384,7 +1595,7 @@
               <w14:ligatures w14:val="standardContextual"/>
             </w:rPr>
           </w:pPr>
-          <w:hyperlink w:anchor="_Toc223087163" w:history="1">
+          <w:hyperlink w:anchor="_Toc223357021" w:history="1">
             <w:r>
               <w:rPr>
                 <w:rStyle w:val="Hyperlink"/>
@@ -1414,7 +1625,7 @@
                 <w:noProof/>
                 <w:webHidden/>
               </w:rPr>
-              <w:instrText xml:space="preserve"> PAGEREF _Toc223087163 \h </w:instrText>
+              <w:instrText xml:space="preserve"> PAGEREF _Toc223357021 \h </w:instrText>
             </w:r>
             <w:r>
               <w:rPr>
@@ -1434,7 +1645,81 @@
                 <w:noProof/>
                 <w:webHidden/>
               </w:rPr>
-              <w:t>6</w:t>
+              <w:t>8</w:t>
+            </w:r>
+            <w:r>
+              <w:rPr>
+                <w:noProof/>
+                <w:webHidden/>
+              </w:rPr>
+              <w:fldChar w:fldCharType="end"/>
+            </w:r>
+          </w:hyperlink>
+        </w:p>
+        <w:p>
+          <w:pPr>
+            <w:pStyle w:val="Verzeichnis2"/>
+            <w:tabs>
+              <w:tab w:val="right" w:leader="dot" w:pos="9062"/>
+            </w:tabs>
+            <w:rPr>
+              <w:noProof/>
+              <w:kern w:val="2"/>
+              <w:sz w:val="24"/>
+              <w:szCs w:val="24"/>
+              <w14:ligatures w14:val="standardContextual"/>
+            </w:rPr>
+          </w:pPr>
+          <w:hyperlink w:anchor="_Toc223357022" w:history="1">
+            <w:r>
+              <w:rPr>
+                <w:rStyle w:val="Hyperlink"/>
+                <w:rFonts w:ascii="Arial" w:hAnsi="Arial" w:cs="Arial"/>
+                <w:b/>
+                <w:noProof/>
+              </w:rPr>
+              <w:t>3.5 Meldewesen bei Abweichungen</w:t>
+            </w:r>
+            <w:r>
+              <w:rPr>
+                <w:noProof/>
+                <w:webHidden/>
+              </w:rPr>
+              <w:tab/>
+            </w:r>
+            <w:r>
+              <w:rPr>
+                <w:noProof/>
+                <w:webHidden/>
+              </w:rPr>
+              <w:fldChar w:fldCharType="begin"/>
+            </w:r>
+            <w:r>
+              <w:rPr>
+                <w:noProof/>
+                <w:webHidden/>
+              </w:rPr>
+              <w:instrText xml:space="preserve"> PAGEREF _Toc223357022 \h </w:instrText>
+            </w:r>
+            <w:r>
+              <w:rPr>
+                <w:noProof/>
+                <w:webHidden/>
+              </w:rPr>
+            </w:r>
+            <w:r>
+              <w:rPr>
+                <w:noProof/>
+                <w:webHidden/>
+              </w:rPr>
+              <w:fldChar w:fldCharType="separate"/>
+            </w:r>
+            <w:r>
+              <w:rPr>
+                <w:noProof/>
+                <w:webHidden/>
+              </w:rPr>
+              <w:t>8</w:t>
             </w:r>
             <w:r>
               <w:rPr>
@@ -1459,7 +1744,7 @@
               <w14:ligatures w14:val="standardContextual"/>
             </w:rPr>
           </w:pPr>
-          <w:hyperlink w:anchor="_Toc223087164" w:history="1">
+          <w:hyperlink w:anchor="_Toc223357023" w:history="1">
             <w:r>
               <w:rPr>
                 <w:rStyle w:val="Hyperlink"/>
@@ -1489,7 +1774,7 @@
                 <w:noProof/>
                 <w:webHidden/>
               </w:rPr>
-              <w:instrText xml:space="preserve"> PAGEREF _Toc223087164 \h </w:instrText>
+              <w:instrText xml:space="preserve"> PAGEREF _Toc223357023 \h </w:instrText>
             </w:r>
             <w:r>
               <w:rPr>
@@ -1509,7 +1794,7 @@
                 <w:noProof/>
                 <w:webHidden/>
               </w:rPr>
-              <w:t>7</w:t>
+              <w:t>9</w:t>
             </w:r>
             <w:r>
               <w:rPr>
@@ -1534,7 +1819,7 @@
               <w14:ligatures w14:val="standardContextual"/>
             </w:rPr>
           </w:pPr>
-          <w:hyperlink w:anchor="_Toc223087165" w:history="1">
+          <w:hyperlink w:anchor="_Toc223357024" w:history="1">
             <w:r>
               <w:rPr>
                 <w:rStyle w:val="Hyperlink"/>
@@ -1563,7 +1848,7 @@
                 <w:noProof/>
                 <w:webHidden/>
               </w:rPr>
-              <w:instrText xml:space="preserve"> PAGEREF _Toc223087165 \h </w:instrText>
+              <w:instrText xml:space="preserve"> PAGEREF _Toc223357024 \h </w:instrText>
             </w:r>
             <w:r>
               <w:rPr>
@@ -1583,7 +1868,7 @@
                 <w:noProof/>
                 <w:webHidden/>
               </w:rPr>
-              <w:t>7</w:t>
+              <w:t>9</w:t>
             </w:r>
             <w:r>
               <w:rPr>
@@ -1608,7 +1893,7 @@
               <w14:ligatures w14:val="standardContextual"/>
             </w:rPr>
           </w:pPr>
-          <w:hyperlink w:anchor="_Toc223087166" w:history="1">
+          <w:hyperlink w:anchor="_Toc223357025" w:history="1">
             <w:r>
               <w:rPr>
                 <w:rStyle w:val="Hyperlink"/>
@@ -1637,7 +1922,7 @@
                 <w:noProof/>
                 <w:webHidden/>
               </w:rPr>
-              <w:instrText xml:space="preserve"> PAGEREF _Toc223087166 \h </w:instrText>
+              <w:instrText xml:space="preserve"> PAGEREF _Toc223357025 \h </w:instrText>
             </w:r>
             <w:r>
               <w:rPr>
@@ -1657,7 +1942,7 @@
                 <w:noProof/>
                 <w:webHidden/>
               </w:rPr>
-              <w:t>7</w:t>
+              <w:t>9</w:t>
             </w:r>
             <w:r>
               <w:rPr>
@@ -1682,7 +1967,7 @@
               <w14:ligatures w14:val="standardContextual"/>
             </w:rPr>
           </w:pPr>
-          <w:hyperlink w:anchor="_Toc223087167" w:history="1">
+          <w:hyperlink w:anchor="_Toc223357026" w:history="1">
             <w:r>
               <w:rPr>
                 <w:rStyle w:val="Hyperlink"/>
@@ -1711,7 +1996,7 @@
                 <w:noProof/>
                 <w:webHidden/>
               </w:rPr>
-              <w:instrText xml:space="preserve"> PAGEREF _Toc223087167 \h </w:instrText>
+              <w:instrText xml:space="preserve"> PAGEREF _Toc223357026 \h </w:instrText>
             </w:r>
             <w:r>
               <w:rPr>
@@ -1731,7 +2016,7 @@
                 <w:noProof/>
                 <w:webHidden/>
               </w:rPr>
-              <w:t>7</w:t>
+              <w:t>9</w:t>
             </w:r>
             <w:r>
               <w:rPr>
@@ -1756,7 +2041,7 @@
               <w14:ligatures w14:val="standardContextual"/>
             </w:rPr>
           </w:pPr>
-          <w:hyperlink w:anchor="_Toc223087168" w:history="1">
+          <w:hyperlink w:anchor="_Toc223357027" w:history="1">
             <w:r>
               <w:rPr>
                 <w:rStyle w:val="Hyperlink"/>
@@ -1786,7 +2071,7 @@
                 <w:noProof/>
                 <w:webHidden/>
               </w:rPr>
-              <w:instrText xml:space="preserve"> PAGEREF _Toc223087168 \h </w:instrText>
+              <w:instrText xml:space="preserve"> PAGEREF _Toc223357027 \h </w:instrText>
             </w:r>
             <w:r>
               <w:rPr>
@@ -1806,7 +2091,7 @@
                 <w:noProof/>
                 <w:webHidden/>
               </w:rPr>
-              <w:t>8</w:t>
+              <w:t>10</w:t>
             </w:r>
             <w:r>
               <w:rPr>
@@ -1831,7 +2116,7 @@
               <w14:ligatures w14:val="standardContextual"/>
             </w:rPr>
           </w:pPr>
-          <w:hyperlink w:anchor="_Toc223087169" w:history="1">
+          <w:hyperlink w:anchor="_Toc223357028" w:history="1">
             <w:r>
               <w:rPr>
                 <w:rStyle w:val="Hyperlink"/>
@@ -1860,7 +2145,7 @@
                 <w:noProof/>
                 <w:webHidden/>
               </w:rPr>
-              <w:instrText xml:space="preserve"> PAGEREF _Toc223087169 \h </w:instrText>
+              <w:instrText xml:space="preserve"> PAGEREF _Toc223357028 \h </w:instrText>
             </w:r>
             <w:r>
               <w:rPr>
@@ -1880,7 +2165,7 @@
                 <w:noProof/>
                 <w:webHidden/>
               </w:rPr>
-              <w:t>8</w:t>
+              <w:t>10</w:t>
             </w:r>
             <w:r>
               <w:rPr>
@@ -1905,7 +2190,7 @@
               <w14:ligatures w14:val="standardContextual"/>
             </w:rPr>
           </w:pPr>
-          <w:hyperlink w:anchor="_Toc223087170" w:history="1">
+          <w:hyperlink w:anchor="_Toc223357029" w:history="1">
             <w:r>
               <w:rPr>
                 <w:rStyle w:val="Hyperlink"/>
@@ -1934,7 +2219,7 @@
                 <w:noProof/>
                 <w:webHidden/>
               </w:rPr>
-              <w:instrText xml:space="preserve"> PAGEREF _Toc223087170 \h </w:instrText>
+              <w:instrText xml:space="preserve"> PAGEREF _Toc223357029 \h </w:instrText>
             </w:r>
             <w:r>
               <w:rPr>
@@ -1954,7 +2239,7 @@
                 <w:noProof/>
                 <w:webHidden/>
               </w:rPr>
-              <w:t>8</w:t>
+              <w:t>10</w:t>
             </w:r>
             <w:r>
               <w:rPr>
@@ -1979,7 +2264,7 @@
               <w14:ligatures w14:val="standardContextual"/>
             </w:rPr>
           </w:pPr>
-          <w:hyperlink w:anchor="_Toc223087171" w:history="1">
+          <w:hyperlink w:anchor="_Toc223357030" w:history="1">
             <w:r>
               <w:rPr>
                 <w:rStyle w:val="Hyperlink"/>
@@ -2008,7 +2293,7 @@
                 <w:noProof/>
                 <w:webHidden/>
               </w:rPr>
-              <w:instrText xml:space="preserve"> PAGEREF _Toc223087171 \h </w:instrText>
+              <w:instrText xml:space="preserve"> PAGEREF _Toc223357030 \h </w:instrText>
             </w:r>
             <w:r>
               <w:rPr>
@@ -2028,7 +2313,7 @@
                 <w:noProof/>
                 <w:webHidden/>
               </w:rPr>
-              <w:t>8</w:t>
+              <w:t>10</w:t>
             </w:r>
             <w:r>
               <w:rPr>
@@ -2053,7 +2338,7 @@
               <w14:ligatures w14:val="standardContextual"/>
             </w:rPr>
           </w:pPr>
-          <w:hyperlink w:anchor="_Toc223087172" w:history="1">
+          <w:hyperlink w:anchor="_Toc223357031" w:history="1">
             <w:r>
               <w:rPr>
                 <w:rStyle w:val="Hyperlink"/>
@@ -2083,7 +2368,7 @@
                 <w:noProof/>
                 <w:webHidden/>
               </w:rPr>
-              <w:instrText xml:space="preserve"> PAGEREF _Toc223087172 \h </w:instrText>
+              <w:instrText xml:space="preserve"> PAGEREF _Toc223357031 \h </w:instrText>
             </w:r>
             <w:r>
               <w:rPr>
@@ -2103,7 +2388,7 @@
                 <w:noProof/>
                 <w:webHidden/>
               </w:rPr>
-              <w:t>9</w:t>
+              <w:t>11</w:t>
             </w:r>
             <w:r>
               <w:rPr>
@@ -2128,7 +2413,7 @@
               <w14:ligatures w14:val="standardContextual"/>
             </w:rPr>
           </w:pPr>
-          <w:hyperlink w:anchor="_Toc223087173" w:history="1">
+          <w:hyperlink w:anchor="_Toc223357032" w:history="1">
             <w:r>
               <w:rPr>
                 <w:rStyle w:val="Hyperlink"/>
@@ -2158,7 +2443,7 @@
                 <w:noProof/>
                 <w:webHidden/>
               </w:rPr>
-              <w:instrText xml:space="preserve"> PAGEREF _Toc223087173 \h </w:instrText>
+              <w:instrText xml:space="preserve"> PAGEREF _Toc223357032 \h </w:instrText>
             </w:r>
             <w:r>
               <w:rPr>
@@ -2178,7 +2463,7 @@
                 <w:noProof/>
                 <w:webHidden/>
               </w:rPr>
-              <w:t>9</w:t>
+              <w:t>11</w:t>
             </w:r>
             <w:r>
               <w:rPr>
@@ -2203,7 +2488,7 @@
               <w14:ligatures w14:val="standardContextual"/>
             </w:rPr>
           </w:pPr>
-          <w:hyperlink w:anchor="_Toc223087174" w:history="1">
+          <w:hyperlink w:anchor="_Toc223357033" w:history="1">
             <w:r>
               <w:rPr>
                 <w:rStyle w:val="Hyperlink"/>
@@ -2233,7 +2518,7 @@
                 <w:noProof/>
                 <w:webHidden/>
               </w:rPr>
-              <w:instrText xml:space="preserve"> PAGEREF _Toc223087174 \h </w:instrText>
+              <w:instrText xml:space="preserve"> PAGEREF _Toc223357033 \h </w:instrText>
             </w:r>
             <w:r>
               <w:rPr>
@@ -2253,7 +2538,7 @@
                 <w:noProof/>
                 <w:webHidden/>
               </w:rPr>
-              <w:t>9</w:t>
+              <w:t>11</w:t>
             </w:r>
             <w:r>
               <w:rPr>
@@ -2278,7 +2563,7 @@
               <w14:ligatures w14:val="standardContextual"/>
             </w:rPr>
           </w:pPr>
-          <w:hyperlink w:anchor="_Toc223087175" w:history="1">
+          <w:hyperlink w:anchor="_Toc223357034" w:history="1">
             <w:r>
               <w:rPr>
                 <w:rStyle w:val="Hyperlink"/>
@@ -2308,7 +2593,7 @@
                 <w:noProof/>
                 <w:webHidden/>
               </w:rPr>
-              <w:instrText xml:space="preserve"> PAGEREF _Toc223087175 \h </w:instrText>
+              <w:instrText xml:space="preserve"> PAGEREF _Toc223357034 \h </w:instrText>
             </w:r>
             <w:r>
               <w:rPr>
@@ -2328,7 +2613,7 @@
                 <w:noProof/>
                 <w:webHidden/>
               </w:rPr>
-              <w:t>10</w:t>
+              <w:t>12</w:t>
             </w:r>
             <w:r>
               <w:rPr>
@@ -2353,7 +2638,7 @@
               <w14:ligatures w14:val="standardContextual"/>
             </w:rPr>
           </w:pPr>
-          <w:hyperlink w:anchor="_Toc223087176" w:history="1">
+          <w:hyperlink w:anchor="_Toc223357035" w:history="1">
             <w:r>
               <w:rPr>
                 <w:rStyle w:val="Hyperlink"/>
@@ -2383,7 +2668,7 @@
                 <w:noProof/>
                 <w:webHidden/>
               </w:rPr>
-              <w:instrText xml:space="preserve"> PAGEREF _Toc223087176 \h </w:instrText>
+              <w:instrText xml:space="preserve"> PAGEREF _Toc223357035 \h </w:instrText>
             </w:r>
             <w:r>
               <w:rPr>
@@ -2403,7 +2688,7 @@
                 <w:noProof/>
                 <w:webHidden/>
               </w:rPr>
-              <w:t>11</w:t>
+              <w:t>13</w:t>
             </w:r>
             <w:r>
               <w:rPr>
@@ -2428,7 +2713,7 @@
               <w14:ligatures w14:val="standardContextual"/>
             </w:rPr>
           </w:pPr>
-          <w:hyperlink w:anchor="_Toc223087177" w:history="1">
+          <w:hyperlink w:anchor="_Toc223357036" w:history="1">
             <w:r>
               <w:rPr>
                 <w:rStyle w:val="Hyperlink"/>
@@ -2458,7 +2743,7 @@
                 <w:noProof/>
                 <w:webHidden/>
               </w:rPr>
-              <w:instrText xml:space="preserve"> PAGEREF _Toc223087177 \h </w:instrText>
+              <w:instrText xml:space="preserve"> PAGEREF _Toc223357036 \h </w:instrText>
             </w:r>
             <w:r>
               <w:rPr>
@@ -2478,7 +2763,7 @@
                 <w:noProof/>
                 <w:webHidden/>
               </w:rPr>
-              <w:t>11</w:t>
+              <w:t>13</w:t>
             </w:r>
             <w:r>
               <w:rPr>
@@ -2503,7 +2788,7 @@
               <w14:ligatures w14:val="standardContextual"/>
             </w:rPr>
           </w:pPr>
-          <w:hyperlink w:anchor="_Toc223087178" w:history="1">
+          <w:hyperlink w:anchor="_Toc223357037" w:history="1">
             <w:r>
               <w:rPr>
                 <w:rStyle w:val="Hyperlink"/>
@@ -2533,7 +2818,7 @@
                 <w:noProof/>
                 <w:webHidden/>
               </w:rPr>
-              <w:instrText xml:space="preserve"> PAGEREF _Toc223087178 \h </w:instrText>
+              <w:instrText xml:space="preserve"> PAGEREF _Toc223357037 \h </w:instrText>
             </w:r>
             <w:r>
               <w:rPr>
@@ -2553,7 +2838,7 @@
                 <w:noProof/>
                 <w:webHidden/>
               </w:rPr>
-              <w:t>11</w:t>
+              <w:t>13</w:t>
             </w:r>
             <w:r>
               <w:rPr>
@@ -2578,7 +2863,7 @@
               <w14:ligatures w14:val="standardContextual"/>
             </w:rPr>
           </w:pPr>
-          <w:hyperlink w:anchor="_Toc223087179" w:history="1">
+          <w:hyperlink w:anchor="_Toc223357038" w:history="1">
             <w:r>
               <w:rPr>
                 <w:rStyle w:val="Hyperlink"/>
@@ -2608,7 +2893,7 @@
                 <w:noProof/>
                 <w:webHidden/>
               </w:rPr>
-              <w:instrText xml:space="preserve"> PAGEREF _Toc223087179 \h </w:instrText>
+              <w:instrText xml:space="preserve"> PAGEREF _Toc223357038 \h </w:instrText>
             </w:r>
             <w:r>
               <w:rPr>
@@ -2628,7 +2913,7 @@
                 <w:noProof/>
                 <w:webHidden/>
               </w:rPr>
-              <w:t>11</w:t>
+              <w:t>13</w:t>
             </w:r>
             <w:r>
               <w:rPr>
@@ -2653,7 +2938,7 @@
               <w14:ligatures w14:val="standardContextual"/>
             </w:rPr>
           </w:pPr>
-          <w:hyperlink w:anchor="_Toc223087180" w:history="1">
+          <w:hyperlink w:anchor="_Toc223357039" w:history="1">
             <w:r>
               <w:rPr>
                 <w:rStyle w:val="Hyperlink"/>
@@ -2683,7 +2968,7 @@
                 <w:noProof/>
                 <w:webHidden/>
               </w:rPr>
-              <w:instrText xml:space="preserve"> PAGEREF _Toc223087180 \h </w:instrText>
+              <w:instrText xml:space="preserve"> PAGEREF _Toc223357039 \h </w:instrText>
             </w:r>
             <w:r>
               <w:rPr>
@@ -2703,7 +2988,7 @@
                 <w:noProof/>
                 <w:webHidden/>
               </w:rPr>
-              <w:t>12</w:t>
+              <w:t>14</w:t>
             </w:r>
             <w:r>
               <w:rPr>
@@ -2728,7 +3013,7 @@
               <w14:ligatures w14:val="standardContextual"/>
             </w:rPr>
           </w:pPr>
-          <w:hyperlink w:anchor="_Toc223087181" w:history="1">
+          <w:hyperlink w:anchor="_Toc223357040" w:history="1">
             <w:r>
               <w:rPr>
                 <w:rStyle w:val="Hyperlink"/>
@@ -2757,7 +3042,7 @@
                 <w:noProof/>
                 <w:webHidden/>
               </w:rPr>
-              <w:instrText xml:space="preserve"> PAGEREF _Toc223087181 \h </w:instrText>
+              <w:instrText xml:space="preserve"> PAGEREF _Toc223357040 \h </w:instrText>
             </w:r>
             <w:r>
               <w:rPr>
@@ -2777,7 +3062,7 @@
                 <w:noProof/>
                 <w:webHidden/>
               </w:rPr>
-              <w:t>12</w:t>
+              <w:t>14</w:t>
             </w:r>
             <w:r>
               <w:rPr>
@@ -2828,7 +3113,7 @@
           <w:color w:val="auto"/>
         </w:rPr>
       </w:pPr>
-      <w:bookmarkStart w:id="1" w:name="_Toc223087153"/>
+      <w:bookmarkStart w:id="1" w:name="_Toc223357008"/>
       <w:r>
         <w:rPr>
           <w:rFonts w:ascii="Arial" w:hAnsi="Arial" w:cs="Arial"/>
@@ -2850,22 +3135,14 @@
           <w:color w:val="auto"/>
         </w:rPr>
       </w:pPr>
-      <w:bookmarkStart w:id="2" w:name="_Toc223087154"/>
+      <w:bookmarkStart w:id="2" w:name="_Toc223357009"/>
       <w:r>
         <w:rPr>
           <w:rFonts w:ascii="Arial" w:hAnsi="Arial" w:cs="Arial"/>
           <w:b/>
           <w:color w:val="auto"/>
         </w:rPr>
-        <w:t xml:space="preserve">1.1. </w:t>
-      </w:r>
-      <w:r>
-        <w:rPr>
-          <w:rFonts w:ascii="Arial" w:hAnsi="Arial" w:cs="Arial"/>
-          <w:b/>
-          <w:color w:val="auto"/>
-        </w:rPr>
-        <w:t>Ziel des Projektes</w:t>
+        <w:t>1.1. Ziel des Projektes</w:t>
       </w:r>
       <w:bookmarkEnd w:id="2"/>
     </w:p>
@@ -3044,7 +3321,7 @@
           <w:color w:val="auto"/>
         </w:rPr>
       </w:pPr>
-      <w:bookmarkStart w:id="3" w:name="_Toc223087155"/>
+      <w:bookmarkStart w:id="3" w:name="_Toc223357010"/>
       <w:r>
         <w:rPr>
           <w:rFonts w:ascii="Arial" w:hAnsi="Arial" w:cs="Arial"/>
@@ -3101,7 +3378,23 @@
           <w:sz w:val="24"/>
           <w:szCs w:val="24"/>
         </w:rPr>
-        <w:t xml:space="preserve"> Diese pflegen die Stammdaten, verwalten die Nutzerkonten und konfigurieren die vier Parkplatz-Raster zur strukturellen Aufteilung der Stellflächen.</w:t>
+        <w:t xml:space="preserve"> Diese pflegen die Stammdaten, verwalten die Nutzerkonten und konfigurieren die </w:t>
+      </w:r>
+      <w:r>
+        <w:rPr>
+          <w:rFonts w:ascii="Arial" w:hAnsi="Arial" w:cs="Arial"/>
+          <w:sz w:val="24"/>
+          <w:szCs w:val="24"/>
+        </w:rPr>
+        <w:t>zwei</w:t>
+      </w:r>
+      <w:r>
+        <w:rPr>
+          <w:rFonts w:ascii="Arial" w:hAnsi="Arial" w:cs="Arial"/>
+          <w:sz w:val="24"/>
+          <w:szCs w:val="24"/>
+        </w:rPr>
+        <w:t xml:space="preserve"> Parkplatz-Raster zur strukturellen Aufteilung der Stellflächen.</w:t>
       </w:r>
     </w:p>
     <w:p>
@@ -3186,15 +3479,32 @@
           <w:sz w:val="24"/>
           <w:szCs w:val="24"/>
         </w:rPr>
-        <w:t>Parkplatzsuchende:</w:t>
-      </w:r>
-      <w:r>
-        <w:rPr>
-          <w:rFonts w:ascii="Arial" w:hAnsi="Arial" w:cs="Arial"/>
-          <w:sz w:val="24"/>
-          <w:szCs w:val="24"/>
-        </w:rPr>
-        <w:t xml:space="preserve"> User ohne eigenen Stellplatz, welche die Raster-Übersicht einsehen können und sich über das „</w:t>
+        <w:t xml:space="preserve">Parkplatzsuchende: </w:t>
+      </w:r>
+      <w:r>
+        <w:rPr>
+          <w:rFonts w:ascii="Arial" w:hAnsi="Arial" w:cs="Arial"/>
+          <w:sz w:val="24"/>
+          <w:szCs w:val="24"/>
+        </w:rPr>
+        <w:t xml:space="preserve">User ohne eigenen Stellplatz, welche die Raster-Übersicht einsehen, </w:t>
+      </w:r>
+      <w:r>
+        <w:rPr>
+          <w:rFonts w:ascii="Arial" w:hAnsi="Arial" w:cs="Arial"/>
+          <w:b/>
+          <w:sz w:val="24"/>
+          <w:szCs w:val="24"/>
+        </w:rPr>
+        <w:t>verfügbare Kapazitäten innerhalb der freigegebenen Zeitfenster</w:t>
+      </w:r>
+      <w:r>
+        <w:rPr>
+          <w:rFonts w:ascii="Arial" w:hAnsi="Arial" w:cs="Arial"/>
+          <w:sz w:val="24"/>
+          <w:szCs w:val="24"/>
+        </w:rPr>
+        <w:t xml:space="preserve"> buchen und sich über das „</w:t>
       </w:r>
       <w:proofErr w:type="spellStart"/>
       <w:r>
@@ -3212,17 +3522,8 @@
           <w:sz w:val="24"/>
           <w:szCs w:val="24"/>
         </w:rPr>
-        <w:t>-in“-Verfahren für Benachrichtigungen bei freien Kapazitäten registrieren.</w:t>
-      </w:r>
-    </w:p>
-    <w:p>
-      <w:pPr>
-        <w:rPr>
-          <w:rFonts w:ascii="Arial" w:hAnsi="Arial" w:cs="Arial"/>
-          <w:sz w:val="24"/>
-          <w:szCs w:val="24"/>
-        </w:rPr>
-      </w:pPr>
+        <w:t>-in“-Verfahren benachrichtigen lassen.</w:t>
+      </w:r>
       <w:r>
         <w:rPr>
           <w:rFonts w:ascii="Arial" w:hAnsi="Arial" w:cs="Arial"/>
@@ -3242,7 +3543,7 @@
           <w:color w:val="auto"/>
         </w:rPr>
       </w:pPr>
-      <w:bookmarkStart w:id="4" w:name="_Toc223087156"/>
+      <w:bookmarkStart w:id="4" w:name="_Toc223357011"/>
       <w:r>
         <w:rPr>
           <w:rFonts w:ascii="Arial" w:hAnsi="Arial" w:cs="Arial"/>
@@ -3265,7 +3566,7 @@
           <w:color w:val="auto"/>
         </w:rPr>
       </w:pPr>
-      <w:bookmarkStart w:id="5" w:name="_Toc223087157"/>
+      <w:bookmarkStart w:id="5" w:name="_Toc223357012"/>
       <w:r>
         <w:rPr>
           <w:rFonts w:ascii="Arial" w:hAnsi="Arial" w:cs="Arial"/>
@@ -3304,7 +3605,7 @@
           <w:color w:val="auto"/>
         </w:rPr>
       </w:pPr>
-      <w:bookmarkStart w:id="6" w:name="_Toc223087158"/>
+      <w:bookmarkStart w:id="6" w:name="_Toc223357013"/>
       <w:r>
         <w:rPr>
           <w:rFonts w:ascii="Arial" w:hAnsi="Arial" w:cs="Arial"/>
@@ -3479,15 +3780,7 @@
           <w:sz w:val="24"/>
           <w:szCs w:val="24"/>
         </w:rPr>
-        <w:t xml:space="preserve"> Die App kann über die "Zum Home-Bildschirm hinzufügen"-Funktion des Browsers als Icon installiert werden und erhält dadurch Zugriff auf Vollbilddarstellung und Web-Push-Funktionalitäten.</w:t>
-      </w:r>
-      <w:r>
-        <w:rPr>
-          <w:rFonts w:ascii="Arial" w:hAnsi="Arial" w:cs="Arial"/>
-          <w:sz w:val="24"/>
-          <w:szCs w:val="24"/>
-        </w:rPr>
-        <w:t xml:space="preserve"> </w:t>
+        <w:t xml:space="preserve"> Die App kann über die "Zum Home-Bildschirm hinzufügen"-Funktion des Browsers als Icon installiert werden und erhält dadurch Zugriff auf Vollbilddarstellung und Web-Push-Funktionalitäten. </w:t>
       </w:r>
     </w:p>
     <w:p>
@@ -3517,7 +3810,7 @@
           <w:color w:val="auto"/>
         </w:rPr>
       </w:pPr>
-      <w:bookmarkStart w:id="7" w:name="_Toc223087159"/>
+      <w:bookmarkStart w:id="7" w:name="_Toc223357014"/>
       <w:r>
         <w:rPr>
           <w:rFonts w:ascii="Arial" w:hAnsi="Arial" w:cs="Arial"/>
@@ -3540,7 +3833,7 @@
           <w:color w:val="auto"/>
         </w:rPr>
       </w:pPr>
-      <w:bookmarkStart w:id="8" w:name="_Toc223087160"/>
+      <w:bookmarkStart w:id="8" w:name="_Toc223357015"/>
       <w:r>
         <w:rPr>
           <w:rFonts w:ascii="Arial" w:hAnsi="Arial" w:cs="Arial"/>
@@ -3659,7 +3952,23 @@
           <w:sz w:val="24"/>
           <w:szCs w:val="24"/>
         </w:rPr>
-        <w:t xml:space="preserve"> Konfiguration der vier Raster (Zonen/Bereiche), um die Parkplätze logisch zu gruppieren und die visuelle Übersicht zu strukturieren.</w:t>
+        <w:t xml:space="preserve"> Konfiguration der </w:t>
+      </w:r>
+      <w:r>
+        <w:rPr>
+          <w:rFonts w:ascii="Arial" w:hAnsi="Arial" w:cs="Arial"/>
+          <w:sz w:val="24"/>
+          <w:szCs w:val="24"/>
+        </w:rPr>
+        <w:t>zwei</w:t>
+      </w:r>
+      <w:r>
+        <w:rPr>
+          <w:rFonts w:ascii="Arial" w:hAnsi="Arial" w:cs="Arial"/>
+          <w:sz w:val="24"/>
+          <w:szCs w:val="24"/>
+        </w:rPr>
+        <w:t xml:space="preserve"> Raster (Zonen/Bereiche), um die Parkplätze logisch zu gruppieren und die visuelle Übersicht zu strukturieren.</w:t>
       </w:r>
     </w:p>
     <w:p>
@@ -3668,19 +3977,17 @@
         <w:rPr>
           <w:rFonts w:ascii="Arial" w:hAnsi="Arial" w:cs="Arial"/>
           <w:b/>
-          <w:bCs/>
           <w:color w:val="auto"/>
         </w:rPr>
       </w:pPr>
-      <w:bookmarkStart w:id="9" w:name="_Toc223087161"/>
-      <w:r>
-        <w:rPr>
-          <w:rFonts w:ascii="Arial" w:hAnsi="Arial" w:cs="Arial"/>
-          <w:b/>
-          <w:bCs/>
+      <w:bookmarkStart w:id="9" w:name="_Toc223357016"/>
+      <w:r>
+        <w:rPr>
+          <w:rFonts w:ascii="Arial" w:hAnsi="Arial" w:cs="Arial"/>
+          <w:b/>
           <w:color w:val="auto"/>
         </w:rPr>
-        <w:t>3.2 Parkplatzstatus und Freigabeprozess</w:t>
+        <w:t>3.2 Parkplatzstatus und Belegungslogik</w:t>
       </w:r>
       <w:bookmarkEnd w:id="9"/>
     </w:p>
@@ -3698,7 +4005,44 @@
           <w:sz w:val="24"/>
           <w:szCs w:val="24"/>
         </w:rPr>
-        <w:t>Dieser Abschnitt definiert die im Anforderungsprofil festgelegten Zustände und die Logik der zeitlichen Freigabe:</w:t>
+        <w:t xml:space="preserve">Dieser Abschnitt definiert die Zustände der Stellplätze sowie die Interaktionsmöglichkeiten für Inhaber und Suchende, um eine lückenlose Koordination der Parkflächen zu gewährleisten. </w:t>
+      </w:r>
+    </w:p>
+    <w:p>
+      <w:pPr>
+        <w:pStyle w:val="berschrift3"/>
+        <w:rPr>
+          <w:rFonts w:ascii="Arial" w:hAnsi="Arial" w:cs="Arial"/>
+          <w:b/>
+          <w:color w:val="auto"/>
+        </w:rPr>
+      </w:pPr>
+      <w:bookmarkStart w:id="10" w:name="_Toc223357017"/>
+      <w:r>
+        <w:rPr>
+          <w:rFonts w:ascii="Arial" w:hAnsi="Arial" w:cs="Arial"/>
+          <w:b/>
+          <w:color w:val="auto"/>
+        </w:rPr>
+        <w:t>3.2.1 Differenzierung der Statuswerte</w:t>
+      </w:r>
+      <w:bookmarkEnd w:id="10"/>
+    </w:p>
+    <w:p>
+      <w:pPr>
+        <w:rPr>
+          <w:rFonts w:ascii="Arial" w:hAnsi="Arial" w:cs="Arial"/>
+          <w:sz w:val="24"/>
+          <w:szCs w:val="24"/>
+        </w:rPr>
+      </w:pPr>
+      <w:r>
+        <w:rPr>
+          <w:rFonts w:ascii="Arial" w:hAnsi="Arial" w:cs="Arial"/>
+          <w:sz w:val="24"/>
+          <w:szCs w:val="24"/>
+        </w:rPr>
+        <w:t>Zur visuellen Steuerung werden drei primäre Zustände unterschieden:</w:t>
       </w:r>
     </w:p>
     <w:p>
@@ -3706,134 +4050,30 @@
         <w:pStyle w:val="Listenabsatz"/>
         <w:numPr>
           <w:ilvl w:val="0"/>
-          <w:numId w:val="12"/>
+          <w:numId w:val="30"/>
         </w:numPr>
         <w:rPr>
           <w:rFonts w:ascii="Arial" w:hAnsi="Arial" w:cs="Arial"/>
-          <w:b/>
-          <w:sz w:val="24"/>
-          <w:szCs w:val="24"/>
-        </w:rPr>
-      </w:pPr>
-      <w:r>
-        <w:rPr>
-          <w:rFonts w:ascii="Arial" w:hAnsi="Arial" w:cs="Arial"/>
-          <w:b/>
-          <w:sz w:val="24"/>
-          <w:szCs w:val="24"/>
-        </w:rPr>
-        <w:t>Differenzierung der Statuswerte:</w:t>
-      </w:r>
-    </w:p>
-    <w:p>
-      <w:pPr>
-        <w:pStyle w:val="Listenabsatz"/>
-        <w:numPr>
-          <w:ilvl w:val="1"/>
-          <w:numId w:val="12"/>
-        </w:numPr>
-        <w:rPr>
-          <w:rFonts w:ascii="Arial" w:hAnsi="Arial" w:cs="Arial"/>
-          <w:sz w:val="24"/>
-          <w:szCs w:val="24"/>
-        </w:rPr>
-      </w:pPr>
-      <w:r>
-        <w:rPr>
-          <w:rFonts w:ascii="Arial" w:hAnsi="Arial" w:cs="Arial"/>
-          <w:b/>
-          <w:sz w:val="24"/>
-          <w:szCs w:val="24"/>
-        </w:rPr>
-        <w:t>Rot:</w:t>
-      </w:r>
-      <w:r>
-        <w:rPr>
-          <w:rFonts w:ascii="Arial" w:hAnsi="Arial" w:cs="Arial"/>
-          <w:sz w:val="24"/>
-          <w:szCs w:val="24"/>
-        </w:rPr>
-        <w:t xml:space="preserve"> Der Parkplatz ist im System vorhanden, aber aktuell nicht freigegeben (Standardstatus für alle freigebenden Plätze).</w:t>
-      </w:r>
-    </w:p>
-    <w:p>
-      <w:pPr>
-        <w:pStyle w:val="Listenabsatz"/>
-        <w:numPr>
-          <w:ilvl w:val="1"/>
-          <w:numId w:val="12"/>
-        </w:numPr>
-        <w:rPr>
-          <w:rFonts w:ascii="Arial" w:hAnsi="Arial" w:cs="Arial"/>
-          <w:sz w:val="24"/>
-          <w:szCs w:val="24"/>
-        </w:rPr>
-      </w:pPr>
-      <w:r>
-        <w:rPr>
-          <w:rFonts w:ascii="Arial" w:hAnsi="Arial" w:cs="Arial"/>
-          <w:b/>
-          <w:sz w:val="24"/>
-          <w:szCs w:val="24"/>
-        </w:rPr>
-        <w:t>Grün:</w:t>
-      </w:r>
-      <w:r>
-        <w:rPr>
-          <w:rFonts w:ascii="Arial" w:hAnsi="Arial" w:cs="Arial"/>
-          <w:sz w:val="24"/>
-          <w:szCs w:val="24"/>
-        </w:rPr>
-        <w:t xml:space="preserve"> Der Parkplatz wurde vom Inhaber aktiv freigegeben und ist somit für andere verfügbar.</w:t>
-      </w:r>
-    </w:p>
-    <w:p>
-      <w:pPr>
-        <w:pStyle w:val="Listenabsatz"/>
-        <w:numPr>
-          <w:ilvl w:val="1"/>
-          <w:numId w:val="12"/>
-        </w:numPr>
-        <w:rPr>
-          <w:rFonts w:ascii="Arial" w:hAnsi="Arial" w:cs="Arial"/>
-          <w:sz w:val="24"/>
-          <w:szCs w:val="24"/>
-        </w:rPr>
-      </w:pPr>
-      <w:r>
-        <w:rPr>
-          <w:rFonts w:ascii="Arial" w:hAnsi="Arial" w:cs="Arial"/>
-          <w:b/>
-          <w:sz w:val="24"/>
-          <w:szCs w:val="24"/>
-        </w:rPr>
-        <w:t>Grau (Nicht hervorgehoben):</w:t>
-      </w:r>
-      <w:r>
-        <w:rPr>
-          <w:rFonts w:ascii="Arial" w:hAnsi="Arial" w:cs="Arial"/>
-          <w:sz w:val="24"/>
-          <w:szCs w:val="24"/>
-        </w:rPr>
-        <w:t xml:space="preserve"> Der Parkplatz gehört grundsätzlich nicht zu den im System </w:t>
-      </w:r>
-      <w:proofErr w:type="spellStart"/>
-      <w:r>
-        <w:rPr>
-          <w:rFonts w:ascii="Arial" w:hAnsi="Arial" w:cs="Arial"/>
-          <w:sz w:val="24"/>
-          <w:szCs w:val="24"/>
-        </w:rPr>
-        <w:t>freigebbaren</w:t>
-      </w:r>
-      <w:proofErr w:type="spellEnd"/>
-      <w:r>
-        <w:rPr>
-          <w:rFonts w:ascii="Arial" w:hAnsi="Arial" w:cs="Arial"/>
-          <w:sz w:val="24"/>
-          <w:szCs w:val="24"/>
-        </w:rPr>
-        <w:t xml:space="preserve"> Parkplätzen.</w:t>
+          <w:sz w:val="24"/>
+          <w:szCs w:val="24"/>
+        </w:rPr>
+      </w:pPr>
+      <w:r>
+        <w:rPr>
+          <w:rFonts w:ascii="Arial" w:hAnsi="Arial" w:cs="Arial"/>
+          <w:b/>
+          <w:sz w:val="24"/>
+          <w:szCs w:val="24"/>
+        </w:rPr>
+        <w:t>Rot (Belegt / Reserviert):</w:t>
+      </w:r>
+      <w:r>
+        <w:rPr>
+          <w:rFonts w:ascii="Arial" w:hAnsi="Arial" w:cs="Arial"/>
+          <w:sz w:val="24"/>
+          <w:szCs w:val="24"/>
+        </w:rPr>
+        <w:t xml:space="preserve"> Der Parkplatz ist im System vorhanden, aber aktuell nicht freigegeben (Standardstatus) oder bereits durch einen Suchenden für einen spezifischen Zeitraum belegt. </w:t>
       </w:r>
     </w:p>
     <w:p>
@@ -3841,85 +4081,30 @@
         <w:pStyle w:val="Listenabsatz"/>
         <w:numPr>
           <w:ilvl w:val="0"/>
-          <w:numId w:val="12"/>
+          <w:numId w:val="30"/>
         </w:numPr>
         <w:rPr>
           <w:rFonts w:ascii="Arial" w:hAnsi="Arial" w:cs="Arial"/>
-          <w:b/>
-          <w:sz w:val="24"/>
-          <w:szCs w:val="24"/>
-        </w:rPr>
-      </w:pPr>
-      <w:r>
-        <w:rPr>
-          <w:rFonts w:ascii="Arial" w:hAnsi="Arial" w:cs="Arial"/>
-          <w:b/>
-          <w:sz w:val="24"/>
-          <w:szCs w:val="24"/>
-        </w:rPr>
-        <w:t>Zeitsteuerung der Freigabe:</w:t>
-      </w:r>
-    </w:p>
-    <w:p>
-      <w:pPr>
-        <w:pStyle w:val="Listenabsatz"/>
-        <w:numPr>
-          <w:ilvl w:val="1"/>
-          <w:numId w:val="12"/>
-        </w:numPr>
-        <w:rPr>
-          <w:rFonts w:ascii="Arial" w:hAnsi="Arial" w:cs="Arial"/>
-          <w:sz w:val="24"/>
-          <w:szCs w:val="24"/>
-        </w:rPr>
-      </w:pPr>
-      <w:r>
-        <w:rPr>
-          <w:rFonts w:ascii="Arial" w:hAnsi="Arial" w:cs="Arial"/>
-          <w:b/>
-          <w:sz w:val="24"/>
-          <w:szCs w:val="24"/>
-        </w:rPr>
-        <w:t>Tagesbezogen:</w:t>
-      </w:r>
-      <w:r>
-        <w:rPr>
-          <w:rFonts w:ascii="Arial" w:hAnsi="Arial" w:cs="Arial"/>
-          <w:sz w:val="24"/>
-          <w:szCs w:val="24"/>
-        </w:rPr>
-        <w:t xml:space="preserve"> Freigabe für den aktuellen Tag.</w:t>
-      </w:r>
-    </w:p>
-    <w:p>
-      <w:pPr>
-        <w:pStyle w:val="Listenabsatz"/>
-        <w:numPr>
-          <w:ilvl w:val="1"/>
-          <w:numId w:val="12"/>
-        </w:numPr>
-        <w:rPr>
-          <w:rFonts w:ascii="Arial" w:hAnsi="Arial" w:cs="Arial"/>
-          <w:sz w:val="24"/>
-          <w:szCs w:val="24"/>
-        </w:rPr>
-      </w:pPr>
-      <w:r>
-        <w:rPr>
-          <w:rFonts w:ascii="Arial" w:hAnsi="Arial" w:cs="Arial"/>
-          <w:b/>
-          <w:sz w:val="24"/>
-          <w:szCs w:val="24"/>
-        </w:rPr>
-        <w:t>Zeitbegrenzt:</w:t>
-      </w:r>
-      <w:r>
-        <w:rPr>
-          <w:rFonts w:ascii="Arial" w:hAnsi="Arial" w:cs="Arial"/>
-          <w:sz w:val="24"/>
-          <w:szCs w:val="24"/>
-        </w:rPr>
-        <w:t xml:space="preserve"> Optionale Freigabe über einen Zeitraum von mehreren Tagen.</w:t>
+          <w:sz w:val="24"/>
+          <w:szCs w:val="24"/>
+        </w:rPr>
+      </w:pPr>
+      <w:r>
+        <w:rPr>
+          <w:rFonts w:ascii="Arial" w:hAnsi="Arial" w:cs="Arial"/>
+          <w:b/>
+          <w:sz w:val="24"/>
+          <w:szCs w:val="24"/>
+        </w:rPr>
+        <w:t>Grün (Verfügbar):</w:t>
+      </w:r>
+      <w:r>
+        <w:rPr>
+          <w:rFonts w:ascii="Arial" w:hAnsi="Arial" w:cs="Arial"/>
+          <w:sz w:val="24"/>
+          <w:szCs w:val="24"/>
+        </w:rPr>
+        <w:t xml:space="preserve"> Der Parkplatz wurde vom Inhaber aktiv freigegeben und steht zur Belegung durch berechtigte Suchende bereit. </w:t>
       </w:r>
     </w:p>
     <w:p>
@@ -3927,31 +4112,75 @@
         <w:pStyle w:val="Listenabsatz"/>
         <w:numPr>
           <w:ilvl w:val="0"/>
-          <w:numId w:val="12"/>
+          <w:numId w:val="30"/>
         </w:numPr>
         <w:rPr>
           <w:rFonts w:ascii="Arial" w:hAnsi="Arial" w:cs="Arial"/>
-          <w:b/>
-          <w:sz w:val="24"/>
-          <w:szCs w:val="24"/>
-        </w:rPr>
-      </w:pPr>
-      <w:r>
-        <w:rPr>
-          <w:rFonts w:ascii="Arial" w:hAnsi="Arial" w:cs="Arial"/>
-          <w:b/>
-          <w:sz w:val="24"/>
-          <w:szCs w:val="24"/>
-        </w:rPr>
-        <w:t>Rücknahmelogik:</w:t>
+          <w:sz w:val="24"/>
+          <w:szCs w:val="24"/>
+        </w:rPr>
+      </w:pPr>
+      <w:r>
+        <w:rPr>
+          <w:rFonts w:ascii="Arial" w:hAnsi="Arial" w:cs="Arial"/>
+          <w:b/>
+          <w:sz w:val="24"/>
+          <w:szCs w:val="24"/>
+        </w:rPr>
+        <w:t>Grau (Nicht systemrelevant):</w:t>
+      </w:r>
+      <w:r>
+        <w:rPr>
+          <w:rFonts w:ascii="Arial" w:hAnsi="Arial" w:cs="Arial"/>
+          <w:sz w:val="24"/>
+          <w:szCs w:val="24"/>
+        </w:rPr>
+        <w:t xml:space="preserve"> Diese Parkflächen nehmen grundsätzlich nicht am digitalen Freigabeprozess teil (z. B. Besucherparkplätze).</w:t>
+      </w:r>
+    </w:p>
+    <w:p>
+      <w:pPr>
+        <w:pStyle w:val="berschrift3"/>
+        <w:rPr>
+          <w:rFonts w:ascii="Arial" w:hAnsi="Arial" w:cs="Arial"/>
+          <w:b/>
+          <w:color w:val="auto"/>
+        </w:rPr>
+      </w:pPr>
+      <w:bookmarkStart w:id="11" w:name="_Toc223357018"/>
+      <w:r>
+        <w:rPr>
+          <w:rFonts w:ascii="Arial" w:hAnsi="Arial" w:cs="Arial"/>
+          <w:b/>
+          <w:color w:val="auto"/>
+        </w:rPr>
+        <w:t>3.2.2 Freigabeprozess durch Parkplatzinhaber</w:t>
+      </w:r>
+      <w:bookmarkEnd w:id="11"/>
+    </w:p>
+    <w:p>
+      <w:pPr>
+        <w:rPr>
+          <w:rFonts w:ascii="Arial" w:hAnsi="Arial" w:cs="Arial"/>
+          <w:sz w:val="24"/>
+          <w:szCs w:val="24"/>
+        </w:rPr>
+      </w:pPr>
+      <w:r>
+        <w:rPr>
+          <w:rFonts w:ascii="Arial" w:hAnsi="Arial" w:cs="Arial"/>
+          <w:sz w:val="24"/>
+          <w:szCs w:val="24"/>
+        </w:rPr>
+        <w:t>Inhaber können ihre fest zugeordneten Plätze wie folgt verwalten:</w:t>
       </w:r>
     </w:p>
     <w:p>
       <w:pPr>
         <w:pStyle w:val="Listenabsatz"/>
         <w:numPr>
-          <w:ilvl w:val="1"/>
-          <w:numId w:val="12"/>
+          <w:ilvl w:val="0"/>
+          <w:numId w:val="31"/>
         </w:numPr>
         <w:rPr>
           <w:rFonts w:ascii="Arial" w:hAnsi="Arial" w:cs="Arial"/>
@@ -3962,18 +4191,27 @@
       <w:r>
         <w:rPr>
           <w:rFonts w:ascii="Arial" w:hAnsi="Arial" w:cs="Arial"/>
-          <w:sz w:val="24"/>
-          <w:szCs w:val="24"/>
-        </w:rPr>
-        <w:t>Der Inhaber kann eine Freigabe für folgende Tage jederzeit zurücknehmen.</w:t>
+          <w:b/>
+          <w:sz w:val="24"/>
+          <w:szCs w:val="24"/>
+        </w:rPr>
+        <w:t>Zeitsteuerung:</w:t>
+      </w:r>
+      <w:r>
+        <w:rPr>
+          <w:rFonts w:ascii="Arial" w:hAnsi="Arial" w:cs="Arial"/>
+          <w:sz w:val="24"/>
+          <w:szCs w:val="24"/>
+        </w:rPr>
+        <w:t xml:space="preserve"> Die Freigabe erfolgt wahlweise tagesbezogen für den aktuellen Tag oder zeitbegrenzt über einen definierten Zeitraum mehrerer Tage.</w:t>
       </w:r>
     </w:p>
     <w:p>
       <w:pPr>
         <w:pStyle w:val="Listenabsatz"/>
         <w:numPr>
-          <w:ilvl w:val="1"/>
-          <w:numId w:val="12"/>
+          <w:ilvl w:val="0"/>
+          <w:numId w:val="31"/>
         </w:numPr>
         <w:rPr>
           <w:rFonts w:ascii="Arial" w:hAnsi="Arial" w:cs="Arial"/>
@@ -3988,6 +4226,37 @@
           <w:sz w:val="24"/>
           <w:szCs w:val="24"/>
         </w:rPr>
+        <w:t>Rücknahmelogik:</w:t>
+      </w:r>
+      <w:r>
+        <w:rPr>
+          <w:rFonts w:ascii="Arial" w:hAnsi="Arial" w:cs="Arial"/>
+          <w:sz w:val="24"/>
+          <w:szCs w:val="24"/>
+        </w:rPr>
+        <w:t xml:space="preserve"> Der Inhaber kann eine Freigabe für zukünftige Tage jederzeit widerrufen.</w:t>
+      </w:r>
+    </w:p>
+    <w:p>
+      <w:pPr>
+        <w:pStyle w:val="Listenabsatz"/>
+        <w:numPr>
+          <w:ilvl w:val="0"/>
+          <w:numId w:val="31"/>
+        </w:numPr>
+        <w:rPr>
+          <w:rFonts w:ascii="Arial" w:hAnsi="Arial" w:cs="Arial"/>
+          <w:sz w:val="24"/>
+          <w:szCs w:val="24"/>
+        </w:rPr>
+      </w:pPr>
+      <w:r>
+        <w:rPr>
+          <w:rFonts w:ascii="Arial" w:hAnsi="Arial" w:cs="Arial"/>
+          <w:b/>
+          <w:sz w:val="24"/>
+          <w:szCs w:val="24"/>
+        </w:rPr>
         <w:t>Informationspflicht:</w:t>
       </w:r>
       <w:r>
@@ -3996,15 +4265,203 @@
           <w:sz w:val="24"/>
           <w:szCs w:val="24"/>
         </w:rPr>
-        <w:t xml:space="preserve"> Bei Rücknahme einer bereits bestehenden Freigabe erfolgt eine automatisierte Information an die reservierende Person.</w:t>
-      </w:r>
-      <w:r>
-        <w:rPr>
-          <w:rFonts w:ascii="Arial" w:hAnsi="Arial" w:cs="Arial"/>
-          <w:sz w:val="24"/>
-          <w:szCs w:val="24"/>
-        </w:rPr>
-        <w:t xml:space="preserve"> </w:t>
+        <w:t xml:space="preserve"> Erfolgt die Rücknahme für einen Zeitraum, der bereits von einem Suchenden belegt wurde, löst das System eine automatisierte Benachrichtigung an die betroffene Person aus.</w:t>
+      </w:r>
+    </w:p>
+    <w:p>
+      <w:pPr>
+        <w:rPr>
+          <w:rFonts w:ascii="Arial" w:hAnsi="Arial" w:cs="Arial"/>
+          <w:sz w:val="24"/>
+          <w:szCs w:val="24"/>
+        </w:rPr>
+      </w:pPr>
+      <w:r>
+        <w:rPr>
+          <w:rFonts w:ascii="Arial" w:hAnsi="Arial" w:cs="Arial"/>
+          <w:sz w:val="24"/>
+          <w:szCs w:val="24"/>
+        </w:rPr>
+        <w:br w:type="page"/>
+      </w:r>
+    </w:p>
+    <w:p>
+      <w:pPr>
+        <w:pStyle w:val="berschrift3"/>
+        <w:rPr>
+          <w:rFonts w:ascii="Arial" w:hAnsi="Arial" w:cs="Arial"/>
+          <w:b/>
+          <w:color w:val="auto"/>
+        </w:rPr>
+      </w:pPr>
+      <w:bookmarkStart w:id="12" w:name="_Toc223357019"/>
+      <w:r>
+        <w:rPr>
+          <w:rFonts w:ascii="Arial" w:hAnsi="Arial" w:cs="Arial"/>
+          <w:b/>
+          <w:color w:val="auto"/>
+        </w:rPr>
+        <w:lastRenderedPageBreak/>
+        <w:t>3.2.3 Belegungsprozess durch Parkplatzsuchende</w:t>
+      </w:r>
+      <w:bookmarkEnd w:id="12"/>
+    </w:p>
+    <w:p>
+      <w:pPr>
+        <w:rPr>
+          <w:rFonts w:ascii="Arial" w:hAnsi="Arial" w:cs="Arial"/>
+          <w:sz w:val="24"/>
+          <w:szCs w:val="24"/>
+        </w:rPr>
+      </w:pPr>
+      <w:r>
+        <w:rPr>
+          <w:rFonts w:ascii="Arial" w:hAnsi="Arial" w:cs="Arial"/>
+          <w:sz w:val="24"/>
+          <w:szCs w:val="24"/>
+        </w:rPr>
+        <w:t>Um die Auslastung zu maximieren, können Suchende aktiv auf freigegebene Kapazitäten zugreifen:</w:t>
+      </w:r>
+    </w:p>
+    <w:p>
+      <w:pPr>
+        <w:pStyle w:val="Listenabsatz"/>
+        <w:numPr>
+          <w:ilvl w:val="0"/>
+          <w:numId w:val="32"/>
+        </w:numPr>
+        <w:rPr>
+          <w:rFonts w:ascii="Arial" w:hAnsi="Arial" w:cs="Arial"/>
+          <w:sz w:val="24"/>
+          <w:szCs w:val="24"/>
+        </w:rPr>
+      </w:pPr>
+      <w:r>
+        <w:rPr>
+          <w:rFonts w:ascii="Arial" w:hAnsi="Arial" w:cs="Arial"/>
+          <w:b/>
+          <w:sz w:val="24"/>
+          <w:szCs w:val="24"/>
+        </w:rPr>
+        <w:t>Aktive Belegung:</w:t>
+      </w:r>
+      <w:r>
+        <w:rPr>
+          <w:rFonts w:ascii="Arial" w:hAnsi="Arial" w:cs="Arial"/>
+          <w:sz w:val="24"/>
+          <w:szCs w:val="24"/>
+        </w:rPr>
+        <w:t xml:space="preserve"> Ein Suchender wählt in der Rasterdarstellung einen „grünen“ Parkplatz aus und beansprucht diesen über die Funktion </w:t>
+      </w:r>
+      <w:r>
+        <w:rPr>
+          <w:rFonts w:ascii="Arial" w:hAnsi="Arial" w:cs="Arial"/>
+          <w:b/>
+          <w:sz w:val="24"/>
+          <w:szCs w:val="24"/>
+        </w:rPr>
+        <w:t>„Jetzt belegen“</w:t>
+      </w:r>
+      <w:r>
+        <w:rPr>
+          <w:rFonts w:ascii="Arial" w:hAnsi="Arial" w:cs="Arial"/>
+          <w:sz w:val="24"/>
+          <w:szCs w:val="24"/>
+        </w:rPr>
+        <w:t>.</w:t>
+      </w:r>
+    </w:p>
+    <w:p>
+      <w:pPr>
+        <w:pStyle w:val="Listenabsatz"/>
+        <w:numPr>
+          <w:ilvl w:val="0"/>
+          <w:numId w:val="32"/>
+        </w:numPr>
+        <w:rPr>
+          <w:rFonts w:ascii="Arial" w:hAnsi="Arial" w:cs="Arial"/>
+          <w:sz w:val="24"/>
+          <w:szCs w:val="24"/>
+        </w:rPr>
+      </w:pPr>
+      <w:r>
+        <w:rPr>
+          <w:rFonts w:ascii="Arial" w:hAnsi="Arial" w:cs="Arial"/>
+          <w:b/>
+          <w:sz w:val="24"/>
+          <w:szCs w:val="24"/>
+        </w:rPr>
+        <w:t>Zeitwahl:</w:t>
+      </w:r>
+      <w:r>
+        <w:rPr>
+          <w:rFonts w:ascii="Arial" w:hAnsi="Arial" w:cs="Arial"/>
+          <w:sz w:val="24"/>
+          <w:szCs w:val="24"/>
+        </w:rPr>
+        <w:t xml:space="preserve"> Der Suchende legt den benötigten Zeitraum (Von-Bis) innerhalb der vom Inhaber gewährten Freigabe fest.</w:t>
+      </w:r>
+    </w:p>
+    <w:p>
+      <w:pPr>
+        <w:pStyle w:val="Listenabsatz"/>
+        <w:numPr>
+          <w:ilvl w:val="0"/>
+          <w:numId w:val="32"/>
+        </w:numPr>
+        <w:rPr>
+          <w:rFonts w:ascii="Arial" w:hAnsi="Arial" w:cs="Arial"/>
+          <w:sz w:val="24"/>
+          <w:szCs w:val="24"/>
+        </w:rPr>
+      </w:pPr>
+      <w:r>
+        <w:rPr>
+          <w:rFonts w:ascii="Arial" w:hAnsi="Arial" w:cs="Arial"/>
+          <w:b/>
+          <w:sz w:val="24"/>
+          <w:szCs w:val="24"/>
+        </w:rPr>
+        <w:t>Überbuchungsschutz:</w:t>
+      </w:r>
+      <w:r>
+        <w:rPr>
+          <w:rFonts w:ascii="Arial" w:hAnsi="Arial" w:cs="Arial"/>
+          <w:sz w:val="24"/>
+          <w:szCs w:val="24"/>
+        </w:rPr>
+        <w:t xml:space="preserve"> Das System validiert die Anfrage in Echtzeit. Eine Belegung über das Ende des Freigabezeitraums hinaus oder eine Überschneidung mit bereits bestehenden Buchungen wird technisch unterbunden.</w:t>
+      </w:r>
+    </w:p>
+    <w:p>
+      <w:pPr>
+        <w:pStyle w:val="Listenabsatz"/>
+        <w:numPr>
+          <w:ilvl w:val="0"/>
+          <w:numId w:val="32"/>
+        </w:numPr>
+        <w:rPr>
+          <w:rFonts w:ascii="Arial" w:hAnsi="Arial" w:cs="Arial"/>
+          <w:sz w:val="24"/>
+          <w:szCs w:val="24"/>
+        </w:rPr>
+      </w:pPr>
+      <w:r>
+        <w:rPr>
+          <w:rFonts w:ascii="Arial" w:hAnsi="Arial" w:cs="Arial"/>
+          <w:b/>
+          <w:sz w:val="24"/>
+          <w:szCs w:val="24"/>
+        </w:rPr>
+        <w:t>Statusaktualisierung:</w:t>
+      </w:r>
+      <w:r>
+        <w:rPr>
+          <w:rFonts w:ascii="Arial" w:hAnsi="Arial" w:cs="Arial"/>
+          <w:sz w:val="24"/>
+          <w:szCs w:val="24"/>
+        </w:rPr>
+        <w:t xml:space="preserve"> Mit Abschluss des Belegungsvorgangs wechselt der Status für den gewählten Zeitraum systemweit auf „Rot“, um eine Doppelbelegung auszuschließen.</w:t>
       </w:r>
       <w:r>
         <w:rPr>
@@ -4025,7 +4482,7 @@
           <w:color w:val="auto"/>
         </w:rPr>
       </w:pPr>
-      <w:bookmarkStart w:id="10" w:name="_Toc223087162"/>
+      <w:bookmarkStart w:id="13" w:name="_Toc223357020"/>
       <w:r>
         <w:rPr>
           <w:rFonts w:ascii="Arial" w:hAnsi="Arial" w:cs="Arial"/>
@@ -4056,7 +4513,7 @@
         </w:rPr>
         <w:t>-in)</w:t>
       </w:r>
-      <w:bookmarkEnd w:id="10"/>
+      <w:bookmarkEnd w:id="13"/>
     </w:p>
     <w:p>
       <w:pPr>
@@ -4196,7 +4653,7 @@
           <w:color w:val="auto"/>
         </w:rPr>
       </w:pPr>
-      <w:bookmarkStart w:id="11" w:name="_Toc223087163"/>
+      <w:bookmarkStart w:id="14" w:name="_Toc223357021"/>
       <w:r>
         <w:rPr>
           <w:rFonts w:ascii="Arial" w:hAnsi="Arial" w:cs="Arial"/>
@@ -4206,23 +4663,39 @@
         </w:rPr>
         <w:t>3.4 Visuelle Rasterdarstellung</w:t>
       </w:r>
-      <w:bookmarkEnd w:id="11"/>
-    </w:p>
-    <w:p>
-      <w:pPr>
-        <w:rPr>
-          <w:rFonts w:ascii="Arial" w:hAnsi="Arial" w:cs="Arial"/>
-          <w:sz w:val="24"/>
-          <w:szCs w:val="24"/>
-        </w:rPr>
-      </w:pPr>
-      <w:r>
-        <w:rPr>
-          <w:rFonts w:ascii="Arial" w:hAnsi="Arial" w:cs="Arial"/>
-          <w:sz w:val="24"/>
-          <w:szCs w:val="24"/>
-        </w:rPr>
-        <w:t>Zur schnellen Orientierung bietet die App eine Übersicht der vier definierten Raster:</w:t>
+      <w:bookmarkEnd w:id="14"/>
+    </w:p>
+    <w:p>
+      <w:pPr>
+        <w:rPr>
+          <w:rFonts w:ascii="Arial" w:hAnsi="Arial" w:cs="Arial"/>
+          <w:sz w:val="24"/>
+          <w:szCs w:val="24"/>
+        </w:rPr>
+      </w:pPr>
+      <w:r>
+        <w:rPr>
+          <w:rFonts w:ascii="Arial" w:hAnsi="Arial" w:cs="Arial"/>
+          <w:sz w:val="24"/>
+          <w:szCs w:val="24"/>
+        </w:rPr>
+        <w:t xml:space="preserve">Zur schnellen Orientierung bietet die App eine Übersicht der </w:t>
+      </w:r>
+      <w:r>
+        <w:rPr>
+          <w:rFonts w:ascii="Arial" w:hAnsi="Arial" w:cs="Arial"/>
+          <w:sz w:val="24"/>
+          <w:szCs w:val="24"/>
+        </w:rPr>
+        <w:t>zwei</w:t>
+      </w:r>
+      <w:r>
+        <w:rPr>
+          <w:rFonts w:ascii="Arial" w:hAnsi="Arial" w:cs="Arial"/>
+          <w:sz w:val="24"/>
+          <w:szCs w:val="24"/>
+        </w:rPr>
+        <w:t xml:space="preserve"> definierten Raster:</w:t>
       </w:r>
     </w:p>
     <w:p>
@@ -4253,7 +4726,39 @@
           <w:sz w:val="24"/>
           <w:szCs w:val="24"/>
         </w:rPr>
-        <w:t xml:space="preserve"> Darstellung der vier Bereiche (z. B. Etagen oder Zonen).</w:t>
+        <w:t xml:space="preserve"> Darstellung der </w:t>
+      </w:r>
+      <w:r>
+        <w:rPr>
+          <w:rFonts w:ascii="Arial" w:hAnsi="Arial" w:cs="Arial"/>
+          <w:sz w:val="24"/>
+          <w:szCs w:val="24"/>
+        </w:rPr>
+        <w:t>zwei</w:t>
+      </w:r>
+      <w:r>
+        <w:rPr>
+          <w:rFonts w:ascii="Arial" w:hAnsi="Arial" w:cs="Arial"/>
+          <w:sz w:val="24"/>
+          <w:szCs w:val="24"/>
+        </w:rPr>
+        <w:t xml:space="preserve"> Bereiche (</w:t>
+      </w:r>
+      <w:r>
+        <w:rPr>
+          <w:rFonts w:ascii="Arial" w:hAnsi="Arial" w:cs="Arial"/>
+          <w:sz w:val="24"/>
+          <w:szCs w:val="24"/>
+        </w:rPr>
+        <w:t>die Zonen</w:t>
+      </w:r>
+      <w:r>
+        <w:rPr>
+          <w:rFonts w:ascii="Arial" w:hAnsi="Arial" w:cs="Arial"/>
+          <w:sz w:val="24"/>
+          <w:szCs w:val="24"/>
+        </w:rPr>
+        <w:t>).</w:t>
       </w:r>
     </w:p>
     <w:p>
@@ -4320,12 +4825,54 @@
     </w:p>
     <w:p>
       <w:pPr>
-        <w:rPr>
-          <w:rFonts w:ascii="Arial" w:hAnsi="Arial" w:cs="Arial"/>
-          <w:sz w:val="24"/>
-          <w:szCs w:val="24"/>
-        </w:rPr>
-      </w:pPr>
+        <w:pStyle w:val="berschrift2"/>
+        <w:rPr>
+          <w:rFonts w:ascii="Arial" w:hAnsi="Arial" w:cs="Arial"/>
+          <w:b/>
+          <w:color w:val="auto"/>
+        </w:rPr>
+      </w:pPr>
+      <w:bookmarkStart w:id="15" w:name="_Toc223357022"/>
+      <w:r>
+        <w:rPr>
+          <w:rFonts w:ascii="Arial" w:hAnsi="Arial" w:cs="Arial"/>
+          <w:b/>
+          <w:color w:val="auto"/>
+        </w:rPr>
+        <w:t>3.5 Meldewesen bei Abweichungen</w:t>
+      </w:r>
+      <w:bookmarkEnd w:id="15"/>
+    </w:p>
+    <w:p>
+      <w:pPr>
+        <w:pStyle w:val="Listenabsatz"/>
+        <w:numPr>
+          <w:ilvl w:val="0"/>
+          <w:numId w:val="29"/>
+        </w:numPr>
+        <w:rPr>
+          <w:rFonts w:ascii="Arial" w:hAnsi="Arial" w:cs="Arial"/>
+          <w:sz w:val="24"/>
+          <w:szCs w:val="24"/>
+        </w:rPr>
+      </w:pPr>
+      <w:r>
+        <w:rPr>
+          <w:rFonts w:ascii="Arial" w:hAnsi="Arial" w:cs="Arial"/>
+          <w:b/>
+          <w:sz w:val="24"/>
+          <w:szCs w:val="24"/>
+        </w:rPr>
+        <w:t>Fehlbelegung melden:</w:t>
+      </w:r>
+      <w:r>
+        <w:rPr>
+          <w:rFonts w:ascii="Arial" w:hAnsi="Arial" w:cs="Arial"/>
+          <w:sz w:val="24"/>
+          <w:szCs w:val="24"/>
+        </w:rPr>
+        <w:t xml:space="preserve"> Stellt ein Suchender vor Ort fest, dass ein als „Frei“ oder „Reserviert“ markierter Platz blockiert ist, kann er dies über einen dedizierten Dialog in der App melden.</w:t>
+      </w:r>
       <w:r>
         <w:rPr>
           <w:rFonts w:ascii="Arial" w:hAnsi="Arial" w:cs="Arial"/>
@@ -4345,7 +4892,7 @@
           <w:color w:val="auto"/>
         </w:rPr>
       </w:pPr>
-      <w:bookmarkStart w:id="12" w:name="_Toc223087164"/>
+      <w:bookmarkStart w:id="16" w:name="_Toc223357023"/>
       <w:r>
         <w:rPr>
           <w:rFonts w:ascii="Arial" w:hAnsi="Arial" w:cs="Arial"/>
@@ -4356,7 +4903,7 @@
         <w:lastRenderedPageBreak/>
         <w:t>4. Nicht-funktionale Anforderungen</w:t>
       </w:r>
-      <w:bookmarkEnd w:id="12"/>
+      <w:bookmarkEnd w:id="16"/>
     </w:p>
     <w:p>
       <w:pPr>
@@ -4367,7 +4914,7 @@
           <w:color w:val="auto"/>
         </w:rPr>
       </w:pPr>
-      <w:bookmarkStart w:id="13" w:name="_Toc223087165"/>
+      <w:bookmarkStart w:id="17" w:name="_Toc223357024"/>
       <w:r>
         <w:rPr>
           <w:rFonts w:ascii="Arial" w:hAnsi="Arial" w:cs="Arial"/>
@@ -4376,7 +4923,7 @@
         </w:rPr>
         <w:t>4.1 Benutzerfreundlichkeit</w:t>
       </w:r>
-      <w:bookmarkEnd w:id="13"/>
+      <w:bookmarkEnd w:id="17"/>
     </w:p>
     <w:p>
       <w:pPr>
@@ -4454,7 +5001,23 @@
           <w:sz w:val="24"/>
           <w:szCs w:val="24"/>
         </w:rPr>
-        <w:t xml:space="preserve"> Die Aufteilung in vier Raster ermöglicht eine übersichtliche Darstellung auch bei einer größeren Anzahl an Parkplätzen.</w:t>
+        <w:t xml:space="preserve"> Die Aufteilung in </w:t>
+      </w:r>
+      <w:r>
+        <w:rPr>
+          <w:rFonts w:ascii="Arial" w:hAnsi="Arial" w:cs="Arial"/>
+          <w:sz w:val="24"/>
+          <w:szCs w:val="24"/>
+        </w:rPr>
+        <w:t>zwei</w:t>
+      </w:r>
+      <w:r>
+        <w:rPr>
+          <w:rFonts w:ascii="Arial" w:hAnsi="Arial" w:cs="Arial"/>
+          <w:sz w:val="24"/>
+          <w:szCs w:val="24"/>
+        </w:rPr>
+        <w:t xml:space="preserve"> Raster ermöglicht eine übersichtliche Darstellung auch bei einer größeren Anzahl an Parkplätzen.</w:t>
       </w:r>
     </w:p>
     <w:p>
@@ -4497,7 +5060,7 @@
           <w:color w:val="auto"/>
         </w:rPr>
       </w:pPr>
-      <w:bookmarkStart w:id="14" w:name="_Toc223087166"/>
+      <w:bookmarkStart w:id="18" w:name="_Toc223357025"/>
       <w:r>
         <w:rPr>
           <w:rFonts w:ascii="Arial" w:hAnsi="Arial" w:cs="Arial"/>
@@ -4506,7 +5069,7 @@
         </w:rPr>
         <w:t>4.2 Plattformen</w:t>
       </w:r>
-      <w:bookmarkEnd w:id="14"/>
+      <w:bookmarkEnd w:id="18"/>
     </w:p>
     <w:p>
       <w:pPr>
@@ -4612,7 +5175,7 @@
           <w:color w:val="auto"/>
         </w:rPr>
       </w:pPr>
-      <w:bookmarkStart w:id="15" w:name="_Toc223087167"/>
+      <w:bookmarkStart w:id="19" w:name="_Toc223357026"/>
       <w:r>
         <w:rPr>
           <w:rFonts w:ascii="Arial" w:hAnsi="Arial" w:cs="Arial"/>
@@ -4621,7 +5184,7 @@
         </w:rPr>
         <w:t>4.3 Verfügbarkeit und Performance</w:t>
       </w:r>
-      <w:bookmarkEnd w:id="15"/>
+      <w:bookmarkEnd w:id="19"/>
     </w:p>
     <w:p>
       <w:pPr>
@@ -4786,7 +5349,7 @@
           <w:color w:val="auto"/>
         </w:rPr>
       </w:pPr>
-      <w:bookmarkStart w:id="16" w:name="_Toc223087168"/>
+      <w:bookmarkStart w:id="20" w:name="_Toc223357027"/>
       <w:r>
         <w:rPr>
           <w:rFonts w:ascii="Arial" w:hAnsi="Arial" w:cs="Arial"/>
@@ -4797,7 +5360,7 @@
         <w:lastRenderedPageBreak/>
         <w:t>5. Erweiterungsoptionen (Optional)</w:t>
       </w:r>
-      <w:bookmarkEnd w:id="16"/>
+      <w:bookmarkEnd w:id="20"/>
     </w:p>
     <w:p>
       <w:pPr>
@@ -4825,7 +5388,7 @@
           <w:color w:val="auto"/>
         </w:rPr>
       </w:pPr>
-      <w:bookmarkStart w:id="17" w:name="_Toc223087169"/>
+      <w:bookmarkStart w:id="21" w:name="_Toc223357028"/>
       <w:r>
         <w:rPr>
           <w:rFonts w:ascii="Arial" w:hAnsi="Arial" w:cs="Arial"/>
@@ -4834,7 +5397,7 @@
         </w:rPr>
         <w:t>5.1 Zeitliche Reservierung und Historie</w:t>
       </w:r>
-      <w:bookmarkEnd w:id="17"/>
+      <w:bookmarkEnd w:id="21"/>
     </w:p>
     <w:p>
       <w:pPr>
@@ -4909,7 +5472,7 @@
           <w:szCs w:val="28"/>
         </w:rPr>
       </w:pPr>
-      <w:bookmarkStart w:id="18" w:name="_Toc223087170"/>
+      <w:bookmarkStart w:id="22" w:name="_Toc223357029"/>
       <w:r>
         <w:rPr>
           <w:rFonts w:ascii="Arial" w:hAnsi="Arial" w:cs="Arial"/>
@@ -4918,7 +5481,7 @@
         </w:rPr>
         <w:t>5.2 Analyse und Statistik</w:t>
       </w:r>
-      <w:bookmarkEnd w:id="18"/>
+      <w:bookmarkEnd w:id="22"/>
     </w:p>
     <w:p>
       <w:pPr>
@@ -4986,7 +5549,7 @@
       <w:pPr>
         <w:pStyle w:val="berschrift2"/>
       </w:pPr>
-      <w:bookmarkStart w:id="19" w:name="_Toc223087171"/>
+      <w:bookmarkStart w:id="23" w:name="_Toc223357030"/>
       <w:r>
         <w:rPr>
           <w:rFonts w:ascii="Arial" w:hAnsi="Arial" w:cs="Arial"/>
@@ -4995,7 +5558,7 @@
         </w:rPr>
         <w:t>5.3 Systemintegration und Identifikation</w:t>
       </w:r>
-      <w:bookmarkEnd w:id="19"/>
+      <w:bookmarkEnd w:id="23"/>
     </w:p>
     <w:p>
       <w:pPr>
@@ -5056,15 +5619,7 @@
           <w:sz w:val="24"/>
           <w:szCs w:val="24"/>
         </w:rPr>
-        <w:t xml:space="preserve"> Integration von QR-Codes oder einer Kennzeichenbindung zur Verifizierung der Berechtigung direkt am Stellplatz.</w:t>
-      </w:r>
-      <w:r>
-        <w:rPr>
-          <w:rFonts w:ascii="Arial" w:hAnsi="Arial" w:cs="Arial"/>
-          <w:sz w:val="24"/>
-          <w:szCs w:val="24"/>
-        </w:rPr>
-        <w:t xml:space="preserve"> </w:t>
+        <w:t xml:space="preserve"> Integration von QR-Codes oder einer Kennzeichenbindung zur Verifizierung der Berechtigung direkt am Stellplatz. </w:t>
       </w:r>
     </w:p>
     <w:p>
@@ -5094,7 +5649,7 @@
           <w:color w:val="auto"/>
         </w:rPr>
       </w:pPr>
-      <w:bookmarkStart w:id="20" w:name="_Toc223087172"/>
+      <w:bookmarkStart w:id="24" w:name="_Toc223357031"/>
       <w:r>
         <w:rPr>
           <w:rFonts w:ascii="Arial" w:hAnsi="Arial" w:cs="Arial"/>
@@ -5105,7 +5660,7 @@
         <w:lastRenderedPageBreak/>
         <w:t>6. Technische Realisierung</w:t>
       </w:r>
-      <w:bookmarkEnd w:id="20"/>
+      <w:bookmarkEnd w:id="24"/>
     </w:p>
     <w:p>
       <w:pPr>
@@ -5117,7 +5672,7 @@
           <w:color w:val="auto"/>
         </w:rPr>
       </w:pPr>
-      <w:bookmarkStart w:id="21" w:name="_Toc223087173"/>
+      <w:bookmarkStart w:id="25" w:name="_Toc223357032"/>
       <w:r>
         <w:rPr>
           <w:rFonts w:ascii="Arial" w:hAnsi="Arial" w:cs="Arial"/>
@@ -5127,7 +5682,7 @@
         </w:rPr>
         <w:t>6.1 Software-Architektur und Tech-Stack</w:t>
       </w:r>
-      <w:bookmarkEnd w:id="21"/>
+      <w:bookmarkEnd w:id="25"/>
     </w:p>
     <w:p>
       <w:pPr>
@@ -5285,7 +5840,7 @@
           <w:color w:val="auto"/>
         </w:rPr>
       </w:pPr>
-      <w:bookmarkStart w:id="22" w:name="_Toc223087174"/>
+      <w:bookmarkStart w:id="26" w:name="_Toc223357033"/>
       <w:r>
         <w:rPr>
           <w:rFonts w:ascii="Arial" w:hAnsi="Arial" w:cs="Arial"/>
@@ -5335,7 +5890,7 @@
         </w:rPr>
         <w:t>-Verfahren</w:t>
       </w:r>
-      <w:bookmarkEnd w:id="22"/>
+      <w:bookmarkEnd w:id="26"/>
     </w:p>
     <w:p>
       <w:pPr>
@@ -5568,7 +6123,7 @@
           <w:color w:val="auto"/>
         </w:rPr>
       </w:pPr>
-      <w:bookmarkStart w:id="23" w:name="_Toc223087175"/>
+      <w:bookmarkStart w:id="27" w:name="_Toc223357034"/>
       <w:r>
         <w:rPr>
           <w:rFonts w:ascii="Arial" w:hAnsi="Arial" w:cs="Arial"/>
@@ -5579,7 +6134,7 @@
         <w:lastRenderedPageBreak/>
         <w:t>6.3 Fehlerbehandlung und Validierung (Backend)</w:t>
       </w:r>
-      <w:bookmarkEnd w:id="23"/>
+      <w:bookmarkEnd w:id="27"/>
     </w:p>
     <w:p>
       <w:pPr>
@@ -5748,15 +6303,7 @@
           <w:sz w:val="24"/>
           <w:szCs w:val="24"/>
         </w:rPr>
-        <w:t xml:space="preserve"> Transaktionale Vorgänge stellen sicher, dass bei einem Verbindungsabbruch während eines Statuswechsels keine inkonsistenten Daten (z. B. ein Platz ohne eindeutigen Status) entstehen.</w:t>
-      </w:r>
-      <w:r>
-        <w:rPr>
-          <w:rFonts w:ascii="Arial" w:hAnsi="Arial" w:cs="Arial"/>
-          <w:sz w:val="24"/>
-          <w:szCs w:val="24"/>
-        </w:rPr>
-        <w:t xml:space="preserve"> </w:t>
+        <w:t xml:space="preserve"> Transaktionale Vorgänge stellen sicher, dass bei einem Verbindungsabbruch während eines Statuswechsels keine inkonsistenten Daten (z. B. ein Platz ohne eindeutigen Status) entstehen. </w:t>
       </w:r>
       <w:r>
         <w:rPr>
@@ -5777,7 +6324,7 @@
           <w:color w:val="auto"/>
         </w:rPr>
       </w:pPr>
-      <w:bookmarkStart w:id="24" w:name="_Toc223087176"/>
+      <w:bookmarkStart w:id="28" w:name="_Toc223357035"/>
       <w:r>
         <w:rPr>
           <w:rFonts w:ascii="Arial" w:hAnsi="Arial" w:cs="Arial"/>
@@ -5788,13 +6335,13 @@
         <w:lastRenderedPageBreak/>
         <w:t>7. Benutzeroberfläche</w:t>
       </w:r>
-      <w:bookmarkEnd w:id="24"/>
+      <w:bookmarkEnd w:id="28"/>
     </w:p>
     <w:p>
       <w:pPr>
         <w:pStyle w:val="berschrift2"/>
       </w:pPr>
-      <w:bookmarkStart w:id="25" w:name="_Toc223087177"/>
+      <w:bookmarkStart w:id="29" w:name="_Toc223357036"/>
       <w:r>
         <w:rPr>
           <w:rFonts w:ascii="Arial" w:hAnsi="Arial" w:cs="Arial"/>
@@ -5804,7 +6351,7 @@
         </w:rPr>
         <w:t>7.1 Visuelles Design und Farbkonzept</w:t>
       </w:r>
-      <w:bookmarkEnd w:id="25"/>
+      <w:bookmarkEnd w:id="29"/>
     </w:p>
     <w:p>
       <w:pPr>
@@ -5944,39 +6491,7 @@
           <w:sz w:val="24"/>
           <w:szCs w:val="24"/>
         </w:rPr>
-        <w:t xml:space="preserve"> Die Visualisierung erfolgt in </w:t>
-      </w:r>
-      <w:r>
-        <w:rPr>
-          <w:rFonts w:ascii="Arial" w:hAnsi="Arial" w:cs="Arial"/>
-          <w:sz w:val="24"/>
-          <w:szCs w:val="24"/>
-        </w:rPr>
-        <w:t>zwei</w:t>
-      </w:r>
-      <w:r>
-        <w:rPr>
-          <w:rFonts w:ascii="Arial" w:hAnsi="Arial" w:cs="Arial"/>
-          <w:sz w:val="24"/>
-          <w:szCs w:val="24"/>
-        </w:rPr>
-        <w:t xml:space="preserve"> Raster (</w:t>
-      </w:r>
-      <w:r>
-        <w:rPr>
-          <w:rFonts w:ascii="Arial" w:hAnsi="Arial" w:cs="Arial"/>
-          <w:sz w:val="24"/>
-          <w:szCs w:val="24"/>
-        </w:rPr>
-        <w:t>die beiden Zonen der Stellplätze</w:t>
-      </w:r>
-      <w:r>
-        <w:rPr>
-          <w:rFonts w:ascii="Arial" w:hAnsi="Arial" w:cs="Arial"/>
-          <w:sz w:val="24"/>
-          <w:szCs w:val="24"/>
-        </w:rPr>
-        <w:t>), um eine schnelle visuelle Orientierung zu ermöglichen, wo grundsätzlich Parkplätze verfügbar sein könnten.</w:t>
+        <w:t xml:space="preserve"> Die Visualisierung erfolgt in zwei Raster (die beiden Zonen der Stellplätze), um eine schnelle visuelle Orientierung zu ermöglichen, wo grundsätzlich Parkplätze verfügbar sein könnten.</w:t>
       </w:r>
     </w:p>
     <w:p>
@@ -5989,7 +6504,7 @@
           <w:color w:val="auto"/>
         </w:rPr>
       </w:pPr>
-      <w:bookmarkStart w:id="26" w:name="_Toc223087178"/>
+      <w:bookmarkStart w:id="30" w:name="_Toc223357037"/>
       <w:r>
         <w:rPr>
           <w:rFonts w:ascii="Arial" w:hAnsi="Arial" w:cs="Arial"/>
@@ -5999,7 +6514,7 @@
         </w:rPr>
         <w:t>7.2 Hauptansichten der App</w:t>
       </w:r>
-      <w:bookmarkEnd w:id="26"/>
+      <w:bookmarkEnd w:id="30"/>
     </w:p>
     <w:p>
       <w:pPr>
@@ -6046,7 +6561,23 @@
           <w:sz w:val="24"/>
           <w:szCs w:val="24"/>
         </w:rPr>
-        <w:t xml:space="preserve"> Zentrale Übersicht der vier Zonen. Jedes Raster zeigt die Anzahl der Parkplätze sowie eine Statusübersicht in Rot/Grün an.</w:t>
+        <w:t xml:space="preserve"> Zentrale Übersicht der </w:t>
+      </w:r>
+      <w:r>
+        <w:rPr>
+          <w:rFonts w:ascii="Arial" w:hAnsi="Arial" w:cs="Arial"/>
+          <w:sz w:val="24"/>
+          <w:szCs w:val="24"/>
+        </w:rPr>
+        <w:t>zwei</w:t>
+      </w:r>
+      <w:r>
+        <w:rPr>
+          <w:rFonts w:ascii="Arial" w:hAnsi="Arial" w:cs="Arial"/>
+          <w:sz w:val="24"/>
+          <w:szCs w:val="24"/>
+        </w:rPr>
+        <w:t xml:space="preserve"> Zonen. Jedes Raster zeigt die Anzahl der Parkplätze sowie eine Statusübersicht in Rot/Grün an.</w:t>
       </w:r>
     </w:p>
     <w:p>
@@ -6089,26 +6620,44 @@
         </w:numPr>
         <w:rPr>
           <w:rFonts w:ascii="Arial" w:hAnsi="Arial" w:cs="Arial"/>
-          <w:sz w:val="24"/>
-          <w:szCs w:val="24"/>
-        </w:rPr>
-      </w:pPr>
-      <w:r>
-        <w:rPr>
-          <w:rFonts w:ascii="Arial" w:hAnsi="Arial" w:cs="Arial"/>
-          <w:b/>
-          <w:sz w:val="24"/>
-          <w:szCs w:val="24"/>
-        </w:rPr>
-        <w:t>Such-Ansicht:</w:t>
-      </w:r>
-      <w:r>
-        <w:rPr>
-          <w:rFonts w:ascii="Arial" w:hAnsi="Arial" w:cs="Arial"/>
-          <w:sz w:val="24"/>
-          <w:szCs w:val="24"/>
-        </w:rPr>
-        <w:t xml:space="preserve"> Darstellung der verfügbaren Parkplätze gemäß Raster-Übersicht für suchende Personen.</w:t>
+          <w:b/>
+          <w:sz w:val="24"/>
+          <w:szCs w:val="24"/>
+        </w:rPr>
+      </w:pPr>
+      <w:r>
+        <w:rPr>
+          <w:rFonts w:ascii="Arial" w:hAnsi="Arial" w:cs="Arial"/>
+          <w:b/>
+          <w:sz w:val="24"/>
+          <w:szCs w:val="24"/>
+        </w:rPr>
+        <w:t xml:space="preserve">Such-Ansicht: </w:t>
+      </w:r>
+      <w:r>
+        <w:rPr>
+          <w:rFonts w:ascii="Arial" w:hAnsi="Arial" w:cs="Arial"/>
+          <w:sz w:val="24"/>
+          <w:szCs w:val="24"/>
+        </w:rPr>
+        <w:t xml:space="preserve">Zeigt die verfügbaren Plätze in der Raster-Übersicht. Bei Klick auf einen grünen Platz öffnet sich ein </w:t>
+      </w:r>
+      <w:r>
+        <w:rPr>
+          <w:rFonts w:ascii="Arial" w:hAnsi="Arial" w:cs="Arial"/>
+          <w:b/>
+          <w:sz w:val="24"/>
+          <w:szCs w:val="24"/>
+        </w:rPr>
+        <w:t>Buchungs-Overlay</w:t>
+      </w:r>
+      <w:r>
+        <w:rPr>
+          <w:rFonts w:ascii="Arial" w:hAnsi="Arial" w:cs="Arial"/>
+          <w:sz w:val="24"/>
+          <w:szCs w:val="24"/>
+        </w:rPr>
+        <w:t>, in dem der Nutzer seinen gewünschten Zeitraum innerhalb der erlaubten Grenzen festlegt.</w:t>
       </w:r>
     </w:p>
     <w:p>
@@ -6139,7 +6688,54 @@
           <w:sz w:val="24"/>
           <w:szCs w:val="24"/>
         </w:rPr>
-        <w:t xml:space="preserve"> Interface zur Verwaltung der Parkplatzinhaber, Suchenden, der Parkplatz-Zuordnungen sowie der vier Raster.</w:t>
+        <w:t xml:space="preserve"> Interface zur Verwaltung der Parkplatzinhaber, Suchenden, der Parkplatz-Zuordnungen sowie der </w:t>
+      </w:r>
+      <w:r>
+        <w:rPr>
+          <w:rFonts w:ascii="Arial" w:hAnsi="Arial" w:cs="Arial"/>
+          <w:sz w:val="24"/>
+          <w:szCs w:val="24"/>
+        </w:rPr>
+        <w:t>zwei</w:t>
+      </w:r>
+      <w:r>
+        <w:rPr>
+          <w:rFonts w:ascii="Arial" w:hAnsi="Arial" w:cs="Arial"/>
+          <w:sz w:val="24"/>
+          <w:szCs w:val="24"/>
+        </w:rPr>
+        <w:t xml:space="preserve"> Raster.</w:t>
+      </w:r>
+    </w:p>
+    <w:p>
+      <w:pPr>
+        <w:pStyle w:val="Listenabsatz"/>
+        <w:numPr>
+          <w:ilvl w:val="0"/>
+          <w:numId w:val="25"/>
+        </w:numPr>
+        <w:rPr>
+          <w:rFonts w:ascii="Arial" w:hAnsi="Arial" w:cs="Arial"/>
+          <w:sz w:val="24"/>
+          <w:szCs w:val="24"/>
+        </w:rPr>
+      </w:pPr>
+      <w:r>
+        <w:rPr>
+          <w:rFonts w:ascii="Arial" w:hAnsi="Arial" w:cs="Arial"/>
+          <w:b/>
+          <w:sz w:val="24"/>
+          <w:szCs w:val="24"/>
+        </w:rPr>
+        <w:t>Bestätigungs-Dialog:</w:t>
+      </w:r>
+      <w:r>
+        <w:rPr>
+          <w:rFonts w:ascii="Arial" w:hAnsi="Arial" w:cs="Arial"/>
+          <w:sz w:val="24"/>
+          <w:szCs w:val="24"/>
+        </w:rPr>
+        <w:t xml:space="preserve"> Nach erfolgreicher Belegung erhält der Nutzer ein visuelles Feedback (Toast/Meldung) mit der Bestätigung seines Zeitraums.</w:t>
       </w:r>
     </w:p>
     <w:p>
@@ -6152,7 +6748,7 @@
           <w:color w:val="auto"/>
         </w:rPr>
       </w:pPr>
-      <w:bookmarkStart w:id="27" w:name="_Toc223087179"/>
+      <w:bookmarkStart w:id="31" w:name="_Toc223357038"/>
       <w:r>
         <w:rPr>
           <w:rFonts w:ascii="Arial" w:hAnsi="Arial" w:cs="Arial"/>
@@ -6162,7 +6758,7 @@
         </w:rPr>
         <w:t>7.3 Interaktionsdesign und Meldewesen</w:t>
       </w:r>
-      <w:bookmarkEnd w:id="27"/>
+      <w:bookmarkEnd w:id="31"/>
     </w:p>
     <w:p>
       <w:pPr>
@@ -6292,15 +6888,7 @@
           <w:sz w:val="24"/>
           <w:szCs w:val="24"/>
         </w:rPr>
-        <w:t xml:space="preserve"> Statusänderungen durch Inhaber führen zu einer sofortigen Aktualisierung der Rasteransicht für alle Nutzer.</w:t>
-      </w:r>
-      <w:r>
-        <w:rPr>
-          <w:rFonts w:ascii="Arial" w:hAnsi="Arial" w:cs="Arial"/>
-          <w:sz w:val="24"/>
-          <w:szCs w:val="24"/>
-        </w:rPr>
-        <w:t xml:space="preserve"> </w:t>
+        <w:t xml:space="preserve"> Statusänderungen durch Inhaber führen zu einer sofortigen Aktualisierung der Rasteransicht für alle Nutzer. </w:t>
       </w:r>
     </w:p>
     <w:p>
@@ -6330,7 +6918,7 @@
           <w:color w:val="auto"/>
         </w:rPr>
       </w:pPr>
-      <w:bookmarkStart w:id="28" w:name="_Toc223087180"/>
+      <w:bookmarkStart w:id="32" w:name="_Toc223357039"/>
       <w:r>
         <w:rPr>
           <w:rFonts w:ascii="Arial" w:hAnsi="Arial" w:cs="Arial"/>
@@ -6341,7 +6929,7 @@
         <w:lastRenderedPageBreak/>
         <w:t>7.4 Fehlermeldungen und User-Feedback</w:t>
       </w:r>
-      <w:bookmarkEnd w:id="28"/>
+      <w:bookmarkEnd w:id="32"/>
     </w:p>
     <w:p>
       <w:pPr>
@@ -6495,7 +7083,7 @@
           <w:szCs w:val="24"/>
         </w:rPr>
       </w:pPr>
-      <w:bookmarkStart w:id="29" w:name="_Toc223087181"/>
+      <w:bookmarkStart w:id="33" w:name="_Toc223357040"/>
       <w:r>
         <w:rPr>
           <w:rFonts w:ascii="Arial" w:hAnsi="Arial" w:cs="Arial"/>
@@ -6504,7 +7092,7 @@
         </w:rPr>
         <w:t>8. Zusammenfassung</w:t>
       </w:r>
-      <w:bookmarkEnd w:id="29"/>
+      <w:bookmarkEnd w:id="33"/>
     </w:p>
     <w:p>
       <w:pPr>
@@ -8869,6 +9457,232 @@
     </w:lvl>
   </w:abstractNum>
   <w:abstractNum w:abstractNumId="11" w15:restartNumberingAfterBreak="0">
+    <w:nsid w:val="267F1586"/>
+    <w:multiLevelType w:val="hybridMultilevel"/>
+    <w:tmpl w:val="C324DD52"/>
+    <w:lvl w:ilvl="0" w:tplc="04070001">
+      <w:start w:val="1"/>
+      <w:numFmt w:val="bullet"/>
+      <w:lvlText w:val=""/>
+      <w:lvlJc w:val="left"/>
+      <w:pPr>
+        <w:ind w:left="720" w:hanging="360"/>
+      </w:pPr>
+      <w:rPr>
+        <w:rFonts w:ascii="Symbol" w:hAnsi="Symbol" w:hint="default"/>
+      </w:rPr>
+    </w:lvl>
+    <w:lvl w:ilvl="1" w:tplc="04070003" w:tentative="1">
+      <w:start w:val="1"/>
+      <w:numFmt w:val="bullet"/>
+      <w:lvlText w:val="o"/>
+      <w:lvlJc w:val="left"/>
+      <w:pPr>
+        <w:ind w:left="1440" w:hanging="360"/>
+      </w:pPr>
+      <w:rPr>
+        <w:rFonts w:ascii="Courier New" w:hAnsi="Courier New" w:cs="Courier New" w:hint="default"/>
+      </w:rPr>
+    </w:lvl>
+    <w:lvl w:ilvl="2" w:tplc="04070005" w:tentative="1">
+      <w:start w:val="1"/>
+      <w:numFmt w:val="bullet"/>
+      <w:lvlText w:val=""/>
+      <w:lvlJc w:val="left"/>
+      <w:pPr>
+        <w:ind w:left="2160" w:hanging="360"/>
+      </w:pPr>
+      <w:rPr>
+        <w:rFonts w:ascii="Wingdings" w:hAnsi="Wingdings" w:hint="default"/>
+      </w:rPr>
+    </w:lvl>
+    <w:lvl w:ilvl="3" w:tplc="04070001" w:tentative="1">
+      <w:start w:val="1"/>
+      <w:numFmt w:val="bullet"/>
+      <w:lvlText w:val=""/>
+      <w:lvlJc w:val="left"/>
+      <w:pPr>
+        <w:ind w:left="2880" w:hanging="360"/>
+      </w:pPr>
+      <w:rPr>
+        <w:rFonts w:ascii="Symbol" w:hAnsi="Symbol" w:hint="default"/>
+      </w:rPr>
+    </w:lvl>
+    <w:lvl w:ilvl="4" w:tplc="04070003" w:tentative="1">
+      <w:start w:val="1"/>
+      <w:numFmt w:val="bullet"/>
+      <w:lvlText w:val="o"/>
+      <w:lvlJc w:val="left"/>
+      <w:pPr>
+        <w:ind w:left="3600" w:hanging="360"/>
+      </w:pPr>
+      <w:rPr>
+        <w:rFonts w:ascii="Courier New" w:hAnsi="Courier New" w:cs="Courier New" w:hint="default"/>
+      </w:rPr>
+    </w:lvl>
+    <w:lvl w:ilvl="5" w:tplc="04070005" w:tentative="1">
+      <w:start w:val="1"/>
+      <w:numFmt w:val="bullet"/>
+      <w:lvlText w:val=""/>
+      <w:lvlJc w:val="left"/>
+      <w:pPr>
+        <w:ind w:left="4320" w:hanging="360"/>
+      </w:pPr>
+      <w:rPr>
+        <w:rFonts w:ascii="Wingdings" w:hAnsi="Wingdings" w:hint="default"/>
+      </w:rPr>
+    </w:lvl>
+    <w:lvl w:ilvl="6" w:tplc="04070001" w:tentative="1">
+      <w:start w:val="1"/>
+      <w:numFmt w:val="bullet"/>
+      <w:lvlText w:val=""/>
+      <w:lvlJc w:val="left"/>
+      <w:pPr>
+        <w:ind w:left="5040" w:hanging="360"/>
+      </w:pPr>
+      <w:rPr>
+        <w:rFonts w:ascii="Symbol" w:hAnsi="Symbol" w:hint="default"/>
+      </w:rPr>
+    </w:lvl>
+    <w:lvl w:ilvl="7" w:tplc="04070003" w:tentative="1">
+      <w:start w:val="1"/>
+      <w:numFmt w:val="bullet"/>
+      <w:lvlText w:val="o"/>
+      <w:lvlJc w:val="left"/>
+      <w:pPr>
+        <w:ind w:left="5760" w:hanging="360"/>
+      </w:pPr>
+      <w:rPr>
+        <w:rFonts w:ascii="Courier New" w:hAnsi="Courier New" w:cs="Courier New" w:hint="default"/>
+      </w:rPr>
+    </w:lvl>
+    <w:lvl w:ilvl="8" w:tplc="04070005" w:tentative="1">
+      <w:start w:val="1"/>
+      <w:numFmt w:val="bullet"/>
+      <w:lvlText w:val=""/>
+      <w:lvlJc w:val="left"/>
+      <w:pPr>
+        <w:ind w:left="6480" w:hanging="360"/>
+      </w:pPr>
+      <w:rPr>
+        <w:rFonts w:ascii="Wingdings" w:hAnsi="Wingdings" w:hint="default"/>
+      </w:rPr>
+    </w:lvl>
+  </w:abstractNum>
+  <w:abstractNum w:abstractNumId="12" w15:restartNumberingAfterBreak="0">
+    <w:nsid w:val="26E83DFC"/>
+    <w:multiLevelType w:val="hybridMultilevel"/>
+    <w:tmpl w:val="7DC0C180"/>
+    <w:lvl w:ilvl="0" w:tplc="04070001">
+      <w:start w:val="1"/>
+      <w:numFmt w:val="bullet"/>
+      <w:lvlText w:val=""/>
+      <w:lvlJc w:val="left"/>
+      <w:pPr>
+        <w:ind w:left="720" w:hanging="360"/>
+      </w:pPr>
+      <w:rPr>
+        <w:rFonts w:ascii="Symbol" w:hAnsi="Symbol" w:hint="default"/>
+      </w:rPr>
+    </w:lvl>
+    <w:lvl w:ilvl="1" w:tplc="04070003" w:tentative="1">
+      <w:start w:val="1"/>
+      <w:numFmt w:val="bullet"/>
+      <w:lvlText w:val="o"/>
+      <w:lvlJc w:val="left"/>
+      <w:pPr>
+        <w:ind w:left="1440" w:hanging="360"/>
+      </w:pPr>
+      <w:rPr>
+        <w:rFonts w:ascii="Courier New" w:hAnsi="Courier New" w:cs="Courier New" w:hint="default"/>
+      </w:rPr>
+    </w:lvl>
+    <w:lvl w:ilvl="2" w:tplc="04070005" w:tentative="1">
+      <w:start w:val="1"/>
+      <w:numFmt w:val="bullet"/>
+      <w:lvlText w:val=""/>
+      <w:lvlJc w:val="left"/>
+      <w:pPr>
+        <w:ind w:left="2160" w:hanging="360"/>
+      </w:pPr>
+      <w:rPr>
+        <w:rFonts w:ascii="Wingdings" w:hAnsi="Wingdings" w:hint="default"/>
+      </w:rPr>
+    </w:lvl>
+    <w:lvl w:ilvl="3" w:tplc="04070001" w:tentative="1">
+      <w:start w:val="1"/>
+      <w:numFmt w:val="bullet"/>
+      <w:lvlText w:val=""/>
+      <w:lvlJc w:val="left"/>
+      <w:pPr>
+        <w:ind w:left="2880" w:hanging="360"/>
+      </w:pPr>
+      <w:rPr>
+        <w:rFonts w:ascii="Symbol" w:hAnsi="Symbol" w:hint="default"/>
+      </w:rPr>
+    </w:lvl>
+    <w:lvl w:ilvl="4" w:tplc="04070003" w:tentative="1">
+      <w:start w:val="1"/>
+      <w:numFmt w:val="bullet"/>
+      <w:lvlText w:val="o"/>
+      <w:lvlJc w:val="left"/>
+      <w:pPr>
+        <w:ind w:left="3600" w:hanging="360"/>
+      </w:pPr>
+      <w:rPr>
+        <w:rFonts w:ascii="Courier New" w:hAnsi="Courier New" w:cs="Courier New" w:hint="default"/>
+      </w:rPr>
+    </w:lvl>
+    <w:lvl w:ilvl="5" w:tplc="04070005" w:tentative="1">
+      <w:start w:val="1"/>
+      <w:numFmt w:val="bullet"/>
+      <w:lvlText w:val=""/>
+      <w:lvlJc w:val="left"/>
+      <w:pPr>
+        <w:ind w:left="4320" w:hanging="360"/>
+      </w:pPr>
+      <w:rPr>
+        <w:rFonts w:ascii="Wingdings" w:hAnsi="Wingdings" w:hint="default"/>
+      </w:rPr>
+    </w:lvl>
+    <w:lvl w:ilvl="6" w:tplc="04070001" w:tentative="1">
+      <w:start w:val="1"/>
+      <w:numFmt w:val="bullet"/>
+      <w:lvlText w:val=""/>
+      <w:lvlJc w:val="left"/>
+      <w:pPr>
+        <w:ind w:left="5040" w:hanging="360"/>
+      </w:pPr>
+      <w:rPr>
+        <w:rFonts w:ascii="Symbol" w:hAnsi="Symbol" w:hint="default"/>
+      </w:rPr>
+    </w:lvl>
+    <w:lvl w:ilvl="7" w:tplc="04070003" w:tentative="1">
+      <w:start w:val="1"/>
+      <w:numFmt w:val="bullet"/>
+      <w:lvlText w:val="o"/>
+      <w:lvlJc w:val="left"/>
+      <w:pPr>
+        <w:ind w:left="5760" w:hanging="360"/>
+      </w:pPr>
+      <w:rPr>
+        <w:rFonts w:ascii="Courier New" w:hAnsi="Courier New" w:cs="Courier New" w:hint="default"/>
+      </w:rPr>
+    </w:lvl>
+    <w:lvl w:ilvl="8" w:tplc="04070005" w:tentative="1">
+      <w:start w:val="1"/>
+      <w:numFmt w:val="bullet"/>
+      <w:lvlText w:val=""/>
+      <w:lvlJc w:val="left"/>
+      <w:pPr>
+        <w:ind w:left="6480" w:hanging="360"/>
+      </w:pPr>
+      <w:rPr>
+        <w:rFonts w:ascii="Wingdings" w:hAnsi="Wingdings" w:hint="default"/>
+      </w:rPr>
+    </w:lvl>
+  </w:abstractNum>
+  <w:abstractNum w:abstractNumId="13" w15:restartNumberingAfterBreak="0">
     <w:nsid w:val="2B41245D"/>
     <w:multiLevelType w:val="hybridMultilevel"/>
     <w:tmpl w:val="7A2AFE84"/>
@@ -8981,7 +9795,7 @@
       </w:rPr>
     </w:lvl>
   </w:abstractNum>
-  <w:abstractNum w:abstractNumId="12" w15:restartNumberingAfterBreak="0">
+  <w:abstractNum w:abstractNumId="14" w15:restartNumberingAfterBreak="0">
     <w:nsid w:val="2FD4258E"/>
     <w:multiLevelType w:val="hybridMultilevel"/>
     <w:tmpl w:val="C1F8DED6"/>
@@ -9094,7 +9908,7 @@
       </w:rPr>
     </w:lvl>
   </w:abstractNum>
-  <w:abstractNum w:abstractNumId="13" w15:restartNumberingAfterBreak="0">
+  <w:abstractNum w:abstractNumId="15" w15:restartNumberingAfterBreak="0">
     <w:nsid w:val="41B7552E"/>
     <w:multiLevelType w:val="hybridMultilevel"/>
     <w:tmpl w:val="3376B8FE"/>
@@ -9207,7 +10021,7 @@
       </w:rPr>
     </w:lvl>
   </w:abstractNum>
-  <w:abstractNum w:abstractNumId="14" w15:restartNumberingAfterBreak="0">
+  <w:abstractNum w:abstractNumId="16" w15:restartNumberingAfterBreak="0">
     <w:nsid w:val="44A70ACD"/>
     <w:multiLevelType w:val="hybridMultilevel"/>
     <w:tmpl w:val="19D66732"/>
@@ -9320,7 +10134,7 @@
       </w:rPr>
     </w:lvl>
   </w:abstractNum>
-  <w:abstractNum w:abstractNumId="15" w15:restartNumberingAfterBreak="0">
+  <w:abstractNum w:abstractNumId="17" w15:restartNumberingAfterBreak="0">
     <w:nsid w:val="45B91810"/>
     <w:multiLevelType w:val="hybridMultilevel"/>
     <w:tmpl w:val="10D0384C"/>
@@ -9433,7 +10247,7 @@
       </w:rPr>
     </w:lvl>
   </w:abstractNum>
-  <w:abstractNum w:abstractNumId="16" w15:restartNumberingAfterBreak="0">
+  <w:abstractNum w:abstractNumId="18" w15:restartNumberingAfterBreak="0">
     <w:nsid w:val="4CF470C8"/>
     <w:multiLevelType w:val="hybridMultilevel"/>
     <w:tmpl w:val="CB70379A"/>
@@ -9546,7 +10360,7 @@
       </w:rPr>
     </w:lvl>
   </w:abstractNum>
-  <w:abstractNum w:abstractNumId="17" w15:restartNumberingAfterBreak="0">
+  <w:abstractNum w:abstractNumId="19" w15:restartNumberingAfterBreak="0">
     <w:nsid w:val="4DBB37EE"/>
     <w:multiLevelType w:val="hybridMultilevel"/>
     <w:tmpl w:val="A7282E42"/>
@@ -9659,7 +10473,7 @@
       </w:rPr>
     </w:lvl>
   </w:abstractNum>
-  <w:abstractNum w:abstractNumId="18" w15:restartNumberingAfterBreak="0">
+  <w:abstractNum w:abstractNumId="20" w15:restartNumberingAfterBreak="0">
     <w:nsid w:val="50AB05D7"/>
     <w:multiLevelType w:val="hybridMultilevel"/>
     <w:tmpl w:val="52CCBABC"/>
@@ -9772,7 +10586,7 @@
       </w:rPr>
     </w:lvl>
   </w:abstractNum>
-  <w:abstractNum w:abstractNumId="19" w15:restartNumberingAfterBreak="0">
+  <w:abstractNum w:abstractNumId="21" w15:restartNumberingAfterBreak="0">
     <w:nsid w:val="52170769"/>
     <w:multiLevelType w:val="hybridMultilevel"/>
     <w:tmpl w:val="C90E976C"/>
@@ -9885,7 +10699,7 @@
       </w:rPr>
     </w:lvl>
   </w:abstractNum>
-  <w:abstractNum w:abstractNumId="20" w15:restartNumberingAfterBreak="0">
+  <w:abstractNum w:abstractNumId="22" w15:restartNumberingAfterBreak="0">
     <w:nsid w:val="529A1CE6"/>
     <w:multiLevelType w:val="hybridMultilevel"/>
     <w:tmpl w:val="C5721EDE"/>
@@ -9998,7 +10812,7 @@
       </w:rPr>
     </w:lvl>
   </w:abstractNum>
-  <w:abstractNum w:abstractNumId="21" w15:restartNumberingAfterBreak="0">
+  <w:abstractNum w:abstractNumId="23" w15:restartNumberingAfterBreak="0">
     <w:nsid w:val="566534FC"/>
     <w:multiLevelType w:val="hybridMultilevel"/>
     <w:tmpl w:val="AB186C64"/>
@@ -10111,7 +10925,7 @@
       </w:rPr>
     </w:lvl>
   </w:abstractNum>
-  <w:abstractNum w:abstractNumId="22" w15:restartNumberingAfterBreak="0">
+  <w:abstractNum w:abstractNumId="24" w15:restartNumberingAfterBreak="0">
     <w:nsid w:val="58980438"/>
     <w:multiLevelType w:val="hybridMultilevel"/>
     <w:tmpl w:val="14FC4FD6"/>
@@ -10224,7 +11038,7 @@
       </w:rPr>
     </w:lvl>
   </w:abstractNum>
-  <w:abstractNum w:abstractNumId="23" w15:restartNumberingAfterBreak="0">
+  <w:abstractNum w:abstractNumId="25" w15:restartNumberingAfterBreak="0">
     <w:nsid w:val="6E311C6F"/>
     <w:multiLevelType w:val="hybridMultilevel"/>
     <w:tmpl w:val="EA127648"/>
@@ -10337,7 +11151,7 @@
       </w:rPr>
     </w:lvl>
   </w:abstractNum>
-  <w:abstractNum w:abstractNumId="24" w15:restartNumberingAfterBreak="0">
+  <w:abstractNum w:abstractNumId="26" w15:restartNumberingAfterBreak="0">
     <w:nsid w:val="6E42377C"/>
     <w:multiLevelType w:val="hybridMultilevel"/>
     <w:tmpl w:val="B1127F52"/>
@@ -10450,7 +11264,7 @@
       </w:rPr>
     </w:lvl>
   </w:abstractNum>
-  <w:abstractNum w:abstractNumId="25" w15:restartNumberingAfterBreak="0">
+  <w:abstractNum w:abstractNumId="27" w15:restartNumberingAfterBreak="0">
     <w:nsid w:val="751460A5"/>
     <w:multiLevelType w:val="hybridMultilevel"/>
     <w:tmpl w:val="EAAA41FE"/>
@@ -10563,7 +11377,7 @@
       </w:rPr>
     </w:lvl>
   </w:abstractNum>
-  <w:abstractNum w:abstractNumId="26" w15:restartNumberingAfterBreak="0">
+  <w:abstractNum w:abstractNumId="28" w15:restartNumberingAfterBreak="0">
     <w:nsid w:val="752440F2"/>
     <w:multiLevelType w:val="hybridMultilevel"/>
     <w:tmpl w:val="053AE628"/>
@@ -10676,7 +11490,120 @@
       </w:rPr>
     </w:lvl>
   </w:abstractNum>
-  <w:abstractNum w:abstractNumId="27" w15:restartNumberingAfterBreak="0">
+  <w:abstractNum w:abstractNumId="29" w15:restartNumberingAfterBreak="0">
+    <w:nsid w:val="769C7E06"/>
+    <w:multiLevelType w:val="hybridMultilevel"/>
+    <w:tmpl w:val="E50E0F4A"/>
+    <w:lvl w:ilvl="0" w:tplc="04070001">
+      <w:start w:val="1"/>
+      <w:numFmt w:val="bullet"/>
+      <w:lvlText w:val=""/>
+      <w:lvlJc w:val="left"/>
+      <w:pPr>
+        <w:ind w:left="720" w:hanging="360"/>
+      </w:pPr>
+      <w:rPr>
+        <w:rFonts w:ascii="Symbol" w:hAnsi="Symbol" w:hint="default"/>
+      </w:rPr>
+    </w:lvl>
+    <w:lvl w:ilvl="1" w:tplc="04070003" w:tentative="1">
+      <w:start w:val="1"/>
+      <w:numFmt w:val="bullet"/>
+      <w:lvlText w:val="o"/>
+      <w:lvlJc w:val="left"/>
+      <w:pPr>
+        <w:ind w:left="1440" w:hanging="360"/>
+      </w:pPr>
+      <w:rPr>
+        <w:rFonts w:ascii="Courier New" w:hAnsi="Courier New" w:cs="Courier New" w:hint="default"/>
+      </w:rPr>
+    </w:lvl>
+    <w:lvl w:ilvl="2" w:tplc="04070005" w:tentative="1">
+      <w:start w:val="1"/>
+      <w:numFmt w:val="bullet"/>
+      <w:lvlText w:val=""/>
+      <w:lvlJc w:val="left"/>
+      <w:pPr>
+        <w:ind w:left="2160" w:hanging="360"/>
+      </w:pPr>
+      <w:rPr>
+        <w:rFonts w:ascii="Wingdings" w:hAnsi="Wingdings" w:hint="default"/>
+      </w:rPr>
+    </w:lvl>
+    <w:lvl w:ilvl="3" w:tplc="04070001" w:tentative="1">
+      <w:start w:val="1"/>
+      <w:numFmt w:val="bullet"/>
+      <w:lvlText w:val=""/>
+      <w:lvlJc w:val="left"/>
+      <w:pPr>
+        <w:ind w:left="2880" w:hanging="360"/>
+      </w:pPr>
+      <w:rPr>
+        <w:rFonts w:ascii="Symbol" w:hAnsi="Symbol" w:hint="default"/>
+      </w:rPr>
+    </w:lvl>
+    <w:lvl w:ilvl="4" w:tplc="04070003" w:tentative="1">
+      <w:start w:val="1"/>
+      <w:numFmt w:val="bullet"/>
+      <w:lvlText w:val="o"/>
+      <w:lvlJc w:val="left"/>
+      <w:pPr>
+        <w:ind w:left="3600" w:hanging="360"/>
+      </w:pPr>
+      <w:rPr>
+        <w:rFonts w:ascii="Courier New" w:hAnsi="Courier New" w:cs="Courier New" w:hint="default"/>
+      </w:rPr>
+    </w:lvl>
+    <w:lvl w:ilvl="5" w:tplc="04070005" w:tentative="1">
+      <w:start w:val="1"/>
+      <w:numFmt w:val="bullet"/>
+      <w:lvlText w:val=""/>
+      <w:lvlJc w:val="left"/>
+      <w:pPr>
+        <w:ind w:left="4320" w:hanging="360"/>
+      </w:pPr>
+      <w:rPr>
+        <w:rFonts w:ascii="Wingdings" w:hAnsi="Wingdings" w:hint="default"/>
+      </w:rPr>
+    </w:lvl>
+    <w:lvl w:ilvl="6" w:tplc="04070001" w:tentative="1">
+      <w:start w:val="1"/>
+      <w:numFmt w:val="bullet"/>
+      <w:lvlText w:val=""/>
+      <w:lvlJc w:val="left"/>
+      <w:pPr>
+        <w:ind w:left="5040" w:hanging="360"/>
+      </w:pPr>
+      <w:rPr>
+        <w:rFonts w:ascii="Symbol" w:hAnsi="Symbol" w:hint="default"/>
+      </w:rPr>
+    </w:lvl>
+    <w:lvl w:ilvl="7" w:tplc="04070003" w:tentative="1">
+      <w:start w:val="1"/>
+      <w:numFmt w:val="bullet"/>
+      <w:lvlText w:val="o"/>
+      <w:lvlJc w:val="left"/>
+      <w:pPr>
+        <w:ind w:left="5760" w:hanging="360"/>
+      </w:pPr>
+      <w:rPr>
+        <w:rFonts w:ascii="Courier New" w:hAnsi="Courier New" w:cs="Courier New" w:hint="default"/>
+      </w:rPr>
+    </w:lvl>
+    <w:lvl w:ilvl="8" w:tplc="04070005" w:tentative="1">
+      <w:start w:val="1"/>
+      <w:numFmt w:val="bullet"/>
+      <w:lvlText w:val=""/>
+      <w:lvlJc w:val="left"/>
+      <w:pPr>
+        <w:ind w:left="6480" w:hanging="360"/>
+      </w:pPr>
+      <w:rPr>
+        <w:rFonts w:ascii="Wingdings" w:hAnsi="Wingdings" w:hint="default"/>
+      </w:rPr>
+    </w:lvl>
+  </w:abstractNum>
+  <w:abstractNum w:abstractNumId="30" w15:restartNumberingAfterBreak="0">
     <w:nsid w:val="77095500"/>
     <w:multiLevelType w:val="hybridMultilevel"/>
     <w:tmpl w:val="3C96991C"/>
@@ -10783,6 +11710,119 @@
       <w:lvlJc w:val="left"/>
       <w:pPr>
         <w:ind w:left="6480" w:hanging="360"/>
+      </w:pPr>
+      <w:rPr>
+        <w:rFonts w:ascii="Wingdings" w:hAnsi="Wingdings" w:hint="default"/>
+      </w:rPr>
+    </w:lvl>
+  </w:abstractNum>
+  <w:abstractNum w:abstractNumId="31" w15:restartNumberingAfterBreak="0">
+    <w:nsid w:val="785B07A7"/>
+    <w:multiLevelType w:val="hybridMultilevel"/>
+    <w:tmpl w:val="6AD866FC"/>
+    <w:lvl w:ilvl="0" w:tplc="04070001">
+      <w:start w:val="1"/>
+      <w:numFmt w:val="bullet"/>
+      <w:lvlText w:val=""/>
+      <w:lvlJc w:val="left"/>
+      <w:pPr>
+        <w:ind w:left="780" w:hanging="360"/>
+      </w:pPr>
+      <w:rPr>
+        <w:rFonts w:ascii="Symbol" w:hAnsi="Symbol" w:hint="default"/>
+      </w:rPr>
+    </w:lvl>
+    <w:lvl w:ilvl="1" w:tplc="04070003" w:tentative="1">
+      <w:start w:val="1"/>
+      <w:numFmt w:val="bullet"/>
+      <w:lvlText w:val="o"/>
+      <w:lvlJc w:val="left"/>
+      <w:pPr>
+        <w:ind w:left="1500" w:hanging="360"/>
+      </w:pPr>
+      <w:rPr>
+        <w:rFonts w:ascii="Courier New" w:hAnsi="Courier New" w:cs="Courier New" w:hint="default"/>
+      </w:rPr>
+    </w:lvl>
+    <w:lvl w:ilvl="2" w:tplc="04070005" w:tentative="1">
+      <w:start w:val="1"/>
+      <w:numFmt w:val="bullet"/>
+      <w:lvlText w:val=""/>
+      <w:lvlJc w:val="left"/>
+      <w:pPr>
+        <w:ind w:left="2220" w:hanging="360"/>
+      </w:pPr>
+      <w:rPr>
+        <w:rFonts w:ascii="Wingdings" w:hAnsi="Wingdings" w:hint="default"/>
+      </w:rPr>
+    </w:lvl>
+    <w:lvl w:ilvl="3" w:tplc="04070001" w:tentative="1">
+      <w:start w:val="1"/>
+      <w:numFmt w:val="bullet"/>
+      <w:lvlText w:val=""/>
+      <w:lvlJc w:val="left"/>
+      <w:pPr>
+        <w:ind w:left="2940" w:hanging="360"/>
+      </w:pPr>
+      <w:rPr>
+        <w:rFonts w:ascii="Symbol" w:hAnsi="Symbol" w:hint="default"/>
+      </w:rPr>
+    </w:lvl>
+    <w:lvl w:ilvl="4" w:tplc="04070003" w:tentative="1">
+      <w:start w:val="1"/>
+      <w:numFmt w:val="bullet"/>
+      <w:lvlText w:val="o"/>
+      <w:lvlJc w:val="left"/>
+      <w:pPr>
+        <w:ind w:left="3660" w:hanging="360"/>
+      </w:pPr>
+      <w:rPr>
+        <w:rFonts w:ascii="Courier New" w:hAnsi="Courier New" w:cs="Courier New" w:hint="default"/>
+      </w:rPr>
+    </w:lvl>
+    <w:lvl w:ilvl="5" w:tplc="04070005" w:tentative="1">
+      <w:start w:val="1"/>
+      <w:numFmt w:val="bullet"/>
+      <w:lvlText w:val=""/>
+      <w:lvlJc w:val="left"/>
+      <w:pPr>
+        <w:ind w:left="4380" w:hanging="360"/>
+      </w:pPr>
+      <w:rPr>
+        <w:rFonts w:ascii="Wingdings" w:hAnsi="Wingdings" w:hint="default"/>
+      </w:rPr>
+    </w:lvl>
+    <w:lvl w:ilvl="6" w:tplc="04070001" w:tentative="1">
+      <w:start w:val="1"/>
+      <w:numFmt w:val="bullet"/>
+      <w:lvlText w:val=""/>
+      <w:lvlJc w:val="left"/>
+      <w:pPr>
+        <w:ind w:left="5100" w:hanging="360"/>
+      </w:pPr>
+      <w:rPr>
+        <w:rFonts w:ascii="Symbol" w:hAnsi="Symbol" w:hint="default"/>
+      </w:rPr>
+    </w:lvl>
+    <w:lvl w:ilvl="7" w:tplc="04070003" w:tentative="1">
+      <w:start w:val="1"/>
+      <w:numFmt w:val="bullet"/>
+      <w:lvlText w:val="o"/>
+      <w:lvlJc w:val="left"/>
+      <w:pPr>
+        <w:ind w:left="5820" w:hanging="360"/>
+      </w:pPr>
+      <w:rPr>
+        <w:rFonts w:ascii="Courier New" w:hAnsi="Courier New" w:cs="Courier New" w:hint="default"/>
+      </w:rPr>
+    </w:lvl>
+    <w:lvl w:ilvl="8" w:tplc="04070005" w:tentative="1">
+      <w:start w:val="1"/>
+      <w:numFmt w:val="bullet"/>
+      <w:lvlText w:val=""/>
+      <w:lvlJc w:val="left"/>
+      <w:pPr>
+        <w:ind w:left="6540" w:hanging="360"/>
       </w:pPr>
       <w:rPr>
         <w:rFonts w:ascii="Wingdings" w:hAnsi="Wingdings" w:hint="default"/>
@@ -10793,61 +11833,61 @@
     <w:abstractNumId w:val="2"/>
   </w:num>
   <w:num w:numId="2" w16cid:durableId="131094049">
-    <w:abstractNumId w:val="14"/>
+    <w:abstractNumId w:val="16"/>
   </w:num>
   <w:num w:numId="3" w16cid:durableId="1495805610">
-    <w:abstractNumId w:val="20"/>
+    <w:abstractNumId w:val="22"/>
   </w:num>
   <w:num w:numId="4" w16cid:durableId="1072049394">
     <w:abstractNumId w:val="3"/>
   </w:num>
   <w:num w:numId="5" w16cid:durableId="1699695765">
-    <w:abstractNumId w:val="12"/>
+    <w:abstractNumId w:val="14"/>
   </w:num>
   <w:num w:numId="6" w16cid:durableId="422577420">
-    <w:abstractNumId w:val="24"/>
+    <w:abstractNumId w:val="26"/>
   </w:num>
   <w:num w:numId="7" w16cid:durableId="1486781553">
     <w:abstractNumId w:val="8"/>
   </w:num>
   <w:num w:numId="8" w16cid:durableId="328363621">
-    <w:abstractNumId w:val="25"/>
+    <w:abstractNumId w:val="27"/>
   </w:num>
   <w:num w:numId="9" w16cid:durableId="1413969119">
-    <w:abstractNumId w:val="26"/>
+    <w:abstractNumId w:val="28"/>
   </w:num>
   <w:num w:numId="10" w16cid:durableId="1386370365">
-    <w:abstractNumId w:val="22"/>
+    <w:abstractNumId w:val="24"/>
   </w:num>
   <w:num w:numId="11" w16cid:durableId="465199532">
-    <w:abstractNumId w:val="16"/>
+    <w:abstractNumId w:val="18"/>
   </w:num>
   <w:num w:numId="12" w16cid:durableId="502431103">
-    <w:abstractNumId w:val="13"/>
+    <w:abstractNumId w:val="15"/>
   </w:num>
   <w:num w:numId="13" w16cid:durableId="613561807">
     <w:abstractNumId w:val="1"/>
   </w:num>
   <w:num w:numId="14" w16cid:durableId="105006554">
-    <w:abstractNumId w:val="27"/>
+    <w:abstractNumId w:val="30"/>
   </w:num>
   <w:num w:numId="15" w16cid:durableId="1776441308">
+    <w:abstractNumId w:val="25"/>
+  </w:num>
+  <w:num w:numId="16" w16cid:durableId="991761604">
+    <w:abstractNumId w:val="19"/>
+  </w:num>
+  <w:num w:numId="17" w16cid:durableId="197008254">
     <w:abstractNumId w:val="23"/>
   </w:num>
-  <w:num w:numId="16" w16cid:durableId="991761604">
-    <w:abstractNumId w:val="17"/>
-  </w:num>
-  <w:num w:numId="17" w16cid:durableId="197008254">
+  <w:num w:numId="18" w16cid:durableId="1707028054">
     <w:abstractNumId w:val="21"/>
-  </w:num>
-  <w:num w:numId="18" w16cid:durableId="1707028054">
-    <w:abstractNumId w:val="19"/>
   </w:num>
   <w:num w:numId="19" w16cid:durableId="440346560">
     <w:abstractNumId w:val="9"/>
   </w:num>
   <w:num w:numId="20" w16cid:durableId="1028918747">
-    <w:abstractNumId w:val="11"/>
+    <w:abstractNumId w:val="13"/>
   </w:num>
   <w:num w:numId="21" w16cid:durableId="8214710">
     <w:abstractNumId w:val="7"/>
@@ -10856,7 +11896,7 @@
     <w:abstractNumId w:val="10"/>
   </w:num>
   <w:num w:numId="23" w16cid:durableId="753747293">
-    <w:abstractNumId w:val="18"/>
+    <w:abstractNumId w:val="20"/>
   </w:num>
   <w:num w:numId="24" w16cid:durableId="113253451">
     <w:abstractNumId w:val="4"/>
@@ -10868,10 +11908,22 @@
     <w:abstractNumId w:val="0"/>
   </w:num>
   <w:num w:numId="27" w16cid:durableId="980421700">
-    <w:abstractNumId w:val="15"/>
+    <w:abstractNumId w:val="17"/>
   </w:num>
   <w:num w:numId="28" w16cid:durableId="555553069">
     <w:abstractNumId w:val="5"/>
+  </w:num>
+  <w:num w:numId="29" w16cid:durableId="2109151256">
+    <w:abstractNumId w:val="31"/>
+  </w:num>
+  <w:num w:numId="30" w16cid:durableId="1726485438">
+    <w:abstractNumId w:val="11"/>
+  </w:num>
+  <w:num w:numId="31" w16cid:durableId="1199003938">
+    <w:abstractNumId w:val="12"/>
+  </w:num>
+  <w:num w:numId="32" w16cid:durableId="121192908">
+    <w:abstractNumId w:val="29"/>
   </w:num>
 </w:numbering>
 </file>
@@ -11587,6 +12639,19 @@
       <w:spacing w:after="0" w:line="240" w:lineRule="auto"/>
     </w:pPr>
   </w:style>
+  <w:style w:type="paragraph" w:styleId="Verzeichnis3">
+    <w:name w:val="toc 3"/>
+    <w:basedOn w:val="Standard"/>
+    <w:next w:val="Standard"/>
+    <w:autoRedefine/>
+    <w:uiPriority w:val="39"/>
+    <w:unhideWhenUsed/>
+    <w:rsid w:val="003F00A5"/>
+    <w:pPr>
+      <w:spacing w:after="100"/>
+      <w:ind w:left="440"/>
+    </w:pPr>
+  </w:style>
 </w:styles>
 </file>
 

</xml_diff>